<commit_message>
Finalizacion del punto 'Planeacion del Proyecto'
</commit_message>
<xml_diff>
--- a/Proyecto Final (Version Final).docx
+++ b/Proyecto Final (Version Final).docx
@@ -1133,8 +1133,6 @@
       <w:sdtPr>
         <w:rPr>
           <w:rFonts w:asciiTheme="minorHAnsi" w:eastAsiaTheme="minorHAnsi" w:hAnsiTheme="minorHAnsi" w:cstheme="minorBidi"/>
-          <w:b w:val="0"/>
-          <w:bCs w:val="0"/>
           <w:color w:val="auto"/>
           <w:spacing w:val="0"/>
           <w:kern w:val="0"/>
@@ -1151,7 +1149,8 @@
       </w:sdtPr>
       <w:sdtEndPr>
         <w:rPr>
-          <w:noProof/>
+          <w:b w:val="0"/>
+          <w:bCs w:val="0"/>
         </w:rPr>
       </w:sdtEndPr>
       <w:sdtContent>
@@ -1162,8 +1161,6 @@
               <w:b w:val="0"/>
               <w:bCs w:val="0"/>
               <w:color w:val="000000" w:themeColor="text1"/>
-              <w:sz w:val="32"/>
-              <w:szCs w:val="32"/>
             </w:rPr>
           </w:pPr>
           <w:r>
@@ -1171,8 +1168,6 @@
               <w:b w:val="0"/>
               <w:bCs w:val="0"/>
               <w:color w:val="000000" w:themeColor="text1"/>
-              <w:sz w:val="32"/>
-              <w:szCs w:val="32"/>
             </w:rPr>
             <w:t>Table of Contents</w:t>
           </w:r>
@@ -1214,27 +1209,13 @@
             </w:rPr>
             <w:fldChar w:fldCharType="separate"/>
           </w:r>
-          <w:hyperlink w:anchor="_Toc230112832" w:history="1">
+          <w:hyperlink w:anchor="_Toc230301181" w:history="1">
             <w:r>
               <w:rPr>
                 <w:rStyle w:val="Hyperlink"/>
                 <w:noProof/>
               </w:rPr>
-              <w:t>1. Resumen Eje</w:t>
-            </w:r>
-            <w:r>
-              <w:rPr>
-                <w:rStyle w:val="Hyperlink"/>
-                <w:noProof/>
-              </w:rPr>
-              <w:t>c</w:t>
-            </w:r>
-            <w:r>
-              <w:rPr>
-                <w:rStyle w:val="Hyperlink"/>
-                <w:noProof/>
-              </w:rPr>
-              <w:t>utivo</w:t>
+              <w:t>1. Resumen Ejecutivo</w:t>
             </w:r>
             <w:r>
               <w:rPr>
@@ -1255,7 +1236,7 @@
                 <w:noProof/>
                 <w:webHidden/>
               </w:rPr>
-              <w:instrText xml:space="preserve"> PAGEREF _Toc230112832 \h </w:instrText>
+              <w:instrText xml:space="preserve"> PAGEREF _Toc230301181 \h </w:instrText>
             </w:r>
             <w:r>
               <w:rPr>
@@ -1304,7 +1285,7 @@
               <w:lang w:val="en-MX"/>
             </w:rPr>
           </w:pPr>
-          <w:hyperlink w:anchor="_Toc230112833" w:history="1">
+          <w:hyperlink w:anchor="_Toc230301182" w:history="1">
             <w:r>
               <w:rPr>
                 <w:rStyle w:val="Hyperlink"/>
@@ -1331,7 +1312,7 @@
                 <w:noProof/>
                 <w:webHidden/>
               </w:rPr>
-              <w:instrText xml:space="preserve"> PAGEREF _Toc230112833 \h </w:instrText>
+              <w:instrText xml:space="preserve"> PAGEREF _Toc230301182 \h </w:instrText>
             </w:r>
             <w:r>
               <w:rPr>
@@ -1380,7 +1361,7 @@
               <w:lang w:val="en-MX"/>
             </w:rPr>
           </w:pPr>
-          <w:hyperlink w:anchor="_Toc230112834" w:history="1">
+          <w:hyperlink w:anchor="_Toc230301183" w:history="1">
             <w:r>
               <w:rPr>
                 <w:rStyle w:val="Hyperlink"/>
@@ -1407,7 +1388,7 @@
                 <w:noProof/>
                 <w:webHidden/>
               </w:rPr>
-              <w:instrText xml:space="preserve"> PAGEREF _Toc230112834 \h </w:instrText>
+              <w:instrText xml:space="preserve"> PAGEREF _Toc230301183 \h </w:instrText>
             </w:r>
             <w:r>
               <w:rPr>
@@ -1456,7 +1437,7 @@
               <w:lang w:val="en-MX"/>
             </w:rPr>
           </w:pPr>
-          <w:hyperlink w:anchor="_Toc230112835" w:history="1">
+          <w:hyperlink w:anchor="_Toc230301184" w:history="1">
             <w:r>
               <w:rPr>
                 <w:rStyle w:val="Hyperlink"/>
@@ -1483,7 +1464,7 @@
                 <w:noProof/>
                 <w:webHidden/>
               </w:rPr>
-              <w:instrText xml:space="preserve"> PAGEREF _Toc230112835 \h </w:instrText>
+              <w:instrText xml:space="preserve"> PAGEREF _Toc230301184 \h </w:instrText>
             </w:r>
             <w:r>
               <w:rPr>
@@ -1532,7 +1513,7 @@
               <w:lang w:val="en-MX"/>
             </w:rPr>
           </w:pPr>
-          <w:hyperlink w:anchor="_Toc230112836" w:history="1">
+          <w:hyperlink w:anchor="_Toc230301185" w:history="1">
             <w:r>
               <w:rPr>
                 <w:rStyle w:val="Hyperlink"/>
@@ -1559,7 +1540,7 @@
                 <w:noProof/>
                 <w:webHidden/>
               </w:rPr>
-              <w:instrText xml:space="preserve"> PAGEREF _Toc230112836 \h </w:instrText>
+              <w:instrText xml:space="preserve"> PAGEREF _Toc230301185 \h </w:instrText>
             </w:r>
             <w:r>
               <w:rPr>
@@ -1609,7 +1590,7 @@
               <w:lang w:val="en-MX"/>
             </w:rPr>
           </w:pPr>
-          <w:hyperlink w:anchor="_Toc230112837" w:history="1">
+          <w:hyperlink w:anchor="_Toc230301186" w:history="1">
             <w:r>
               <w:rPr>
                 <w:rStyle w:val="Hyperlink"/>
@@ -1636,7 +1617,7 @@
                 <w:noProof/>
                 <w:webHidden/>
               </w:rPr>
-              <w:instrText xml:space="preserve"> PAGEREF _Toc230112837 \h </w:instrText>
+              <w:instrText xml:space="preserve"> PAGEREF _Toc230301186 \h </w:instrText>
             </w:r>
             <w:r>
               <w:rPr>
@@ -1685,7 +1666,7 @@
               <w:lang w:val="en-MX"/>
             </w:rPr>
           </w:pPr>
-          <w:hyperlink w:anchor="_Toc230112838" w:history="1">
+          <w:hyperlink w:anchor="_Toc230301187" w:history="1">
             <w:r>
               <w:rPr>
                 <w:rStyle w:val="Hyperlink"/>
@@ -1712,7 +1693,7 @@
                 <w:noProof/>
                 <w:webHidden/>
               </w:rPr>
-              <w:instrText xml:space="preserve"> PAGEREF _Toc230112838 \h </w:instrText>
+              <w:instrText xml:space="preserve"> PAGEREF _Toc230301187 \h </w:instrText>
             </w:r>
             <w:r>
               <w:rPr>
@@ -1761,7 +1742,7 @@
               <w:lang w:val="en-MX"/>
             </w:rPr>
           </w:pPr>
-          <w:hyperlink w:anchor="_Toc230112839" w:history="1">
+          <w:hyperlink w:anchor="_Toc230301188" w:history="1">
             <w:r>
               <w:rPr>
                 <w:rStyle w:val="Hyperlink"/>
@@ -1788,7 +1769,7 @@
                 <w:noProof/>
                 <w:webHidden/>
               </w:rPr>
-              <w:instrText xml:space="preserve"> PAGEREF _Toc230112839 \h </w:instrText>
+              <w:instrText xml:space="preserve"> PAGEREF _Toc230301188 \h </w:instrText>
             </w:r>
             <w:r>
               <w:rPr>
@@ -1837,7 +1818,7 @@
               <w:lang w:val="en-MX"/>
             </w:rPr>
           </w:pPr>
-          <w:hyperlink w:anchor="_Toc230112840" w:history="1">
+          <w:hyperlink w:anchor="_Toc230301189" w:history="1">
             <w:r>
               <w:rPr>
                 <w:rStyle w:val="Hyperlink"/>
@@ -1864,7 +1845,7 @@
                 <w:noProof/>
                 <w:webHidden/>
               </w:rPr>
-              <w:instrText xml:space="preserve"> PAGEREF _Toc230112840 \h </w:instrText>
+              <w:instrText xml:space="preserve"> PAGEREF _Toc230301189 \h </w:instrText>
             </w:r>
             <w:r>
               <w:rPr>
@@ -1913,7 +1894,7 @@
               <w:lang w:val="en-MX"/>
             </w:rPr>
           </w:pPr>
-          <w:hyperlink w:anchor="_Toc230112841" w:history="1">
+          <w:hyperlink w:anchor="_Toc230301190" w:history="1">
             <w:r>
               <w:rPr>
                 <w:rStyle w:val="Hyperlink"/>
@@ -1940,7 +1921,7 @@
                 <w:noProof/>
                 <w:webHidden/>
               </w:rPr>
-              <w:instrText xml:space="preserve"> PAGEREF _Toc230112841 \h </w:instrText>
+              <w:instrText xml:space="preserve"> PAGEREF _Toc230301190 \h </w:instrText>
             </w:r>
             <w:r>
               <w:rPr>
@@ -1990,7 +1971,7 @@
               <w:lang w:val="en-MX"/>
             </w:rPr>
           </w:pPr>
-          <w:hyperlink w:anchor="_Toc230112842" w:history="1">
+          <w:hyperlink w:anchor="_Toc230301191" w:history="1">
             <w:r>
               <w:rPr>
                 <w:rStyle w:val="Hyperlink"/>
@@ -2017,7 +1998,7 @@
                 <w:noProof/>
                 <w:webHidden/>
               </w:rPr>
-              <w:instrText xml:space="preserve"> PAGEREF _Toc230112842 \h </w:instrText>
+              <w:instrText xml:space="preserve"> PAGEREF _Toc230301191 \h </w:instrText>
             </w:r>
             <w:r>
               <w:rPr>
@@ -2066,7 +2047,7 @@
               <w:lang w:val="en-MX"/>
             </w:rPr>
           </w:pPr>
-          <w:hyperlink w:anchor="_Toc230112843" w:history="1">
+          <w:hyperlink w:anchor="_Toc230301192" w:history="1">
             <w:r>
               <w:rPr>
                 <w:rStyle w:val="Hyperlink"/>
@@ -2093,7 +2074,7 @@
                 <w:noProof/>
                 <w:webHidden/>
               </w:rPr>
-              <w:instrText xml:space="preserve"> PAGEREF _Toc230112843 \h </w:instrText>
+              <w:instrText xml:space="preserve"> PAGEREF _Toc230301192 \h </w:instrText>
             </w:r>
             <w:r>
               <w:rPr>
@@ -2142,7 +2123,7 @@
               <w:lang w:val="en-MX"/>
             </w:rPr>
           </w:pPr>
-          <w:hyperlink w:anchor="_Toc230112844" w:history="1">
+          <w:hyperlink w:anchor="_Toc230301193" w:history="1">
             <w:r>
               <w:rPr>
                 <w:rStyle w:val="Hyperlink"/>
@@ -2169,7 +2150,7 @@
                 <w:noProof/>
                 <w:webHidden/>
               </w:rPr>
-              <w:instrText xml:space="preserve"> PAGEREF _Toc230112844 \h </w:instrText>
+              <w:instrText xml:space="preserve"> PAGEREF _Toc230301193 \h </w:instrText>
             </w:r>
             <w:r>
               <w:rPr>
@@ -2218,7 +2199,7 @@
               <w:lang w:val="en-MX"/>
             </w:rPr>
           </w:pPr>
-          <w:hyperlink w:anchor="_Toc230112845" w:history="1">
+          <w:hyperlink w:anchor="_Toc230301194" w:history="1">
             <w:r>
               <w:rPr>
                 <w:rStyle w:val="Hyperlink"/>
@@ -2245,7 +2226,7 @@
                 <w:noProof/>
                 <w:webHidden/>
               </w:rPr>
-              <w:instrText xml:space="preserve"> PAGEREF _Toc230112845 \h </w:instrText>
+              <w:instrText xml:space="preserve"> PAGEREF _Toc230301194 \h </w:instrText>
             </w:r>
             <w:r>
               <w:rPr>
@@ -2295,7 +2276,7 @@
               <w:lang w:val="en-MX"/>
             </w:rPr>
           </w:pPr>
-          <w:hyperlink w:anchor="_Toc230112846" w:history="1">
+          <w:hyperlink w:anchor="_Toc230301195" w:history="1">
             <w:r>
               <w:rPr>
                 <w:rStyle w:val="Hyperlink"/>
@@ -2322,7 +2303,7 @@
                 <w:noProof/>
                 <w:webHidden/>
               </w:rPr>
-              <w:instrText xml:space="preserve"> PAGEREF _Toc230112846 \h </w:instrText>
+              <w:instrText xml:space="preserve"> PAGEREF _Toc230301195 \h </w:instrText>
             </w:r>
             <w:r>
               <w:rPr>
@@ -2371,7 +2352,7 @@
               <w:lang w:val="en-MX"/>
             </w:rPr>
           </w:pPr>
-          <w:hyperlink w:anchor="_Toc230112847" w:history="1">
+          <w:hyperlink w:anchor="_Toc230301196" w:history="1">
             <w:r>
               <w:rPr>
                 <w:rStyle w:val="Hyperlink"/>
@@ -2398,7 +2379,7 @@
                 <w:noProof/>
                 <w:webHidden/>
               </w:rPr>
-              <w:instrText xml:space="preserve"> PAGEREF _Toc230112847 \h </w:instrText>
+              <w:instrText xml:space="preserve"> PAGEREF _Toc230301196 \h </w:instrText>
             </w:r>
             <w:r>
               <w:rPr>
@@ -2447,7 +2428,7 @@
               <w:lang w:val="en-MX"/>
             </w:rPr>
           </w:pPr>
-          <w:hyperlink w:anchor="_Toc230112848" w:history="1">
+          <w:hyperlink w:anchor="_Toc230301197" w:history="1">
             <w:r>
               <w:rPr>
                 <w:rStyle w:val="Hyperlink"/>
@@ -2474,7 +2455,7 @@
                 <w:noProof/>
                 <w:webHidden/>
               </w:rPr>
-              <w:instrText xml:space="preserve"> PAGEREF _Toc230112848 \h </w:instrText>
+              <w:instrText xml:space="preserve"> PAGEREF _Toc230301197 \h </w:instrText>
             </w:r>
             <w:r>
               <w:rPr>
@@ -2523,7 +2504,7 @@
               <w:lang w:val="en-MX"/>
             </w:rPr>
           </w:pPr>
-          <w:hyperlink w:anchor="_Toc230112849" w:history="1">
+          <w:hyperlink w:anchor="_Toc230301198" w:history="1">
             <w:r>
               <w:rPr>
                 <w:rStyle w:val="Hyperlink"/>
@@ -2550,7 +2531,7 @@
                 <w:noProof/>
                 <w:webHidden/>
               </w:rPr>
-              <w:instrText xml:space="preserve"> PAGEREF _Toc230112849 \h </w:instrText>
+              <w:instrText xml:space="preserve"> PAGEREF _Toc230301198 \h </w:instrText>
             </w:r>
             <w:r>
               <w:rPr>
@@ -2600,7 +2581,7 @@
               <w:lang w:val="en-MX"/>
             </w:rPr>
           </w:pPr>
-          <w:hyperlink w:anchor="_Toc230112850" w:history="1">
+          <w:hyperlink w:anchor="_Toc230301199" w:history="1">
             <w:r>
               <w:rPr>
                 <w:rStyle w:val="Hyperlink"/>
@@ -2627,7 +2608,7 @@
                 <w:noProof/>
                 <w:webHidden/>
               </w:rPr>
-              <w:instrText xml:space="preserve"> PAGEREF _Toc230112850 \h </w:instrText>
+              <w:instrText xml:space="preserve"> PAGEREF _Toc230301199 \h </w:instrText>
             </w:r>
             <w:r>
               <w:rPr>
@@ -2676,7 +2657,7 @@
               <w:lang w:val="en-MX"/>
             </w:rPr>
           </w:pPr>
-          <w:hyperlink w:anchor="_Toc230112851" w:history="1">
+          <w:hyperlink w:anchor="_Toc230301200" w:history="1">
             <w:r>
               <w:rPr>
                 <w:rStyle w:val="Hyperlink"/>
@@ -2703,7 +2684,7 @@
                 <w:noProof/>
                 <w:webHidden/>
               </w:rPr>
-              <w:instrText xml:space="preserve"> PAGEREF _Toc230112851 \h </w:instrText>
+              <w:instrText xml:space="preserve"> PAGEREF _Toc230301200 \h </w:instrText>
             </w:r>
             <w:r>
               <w:rPr>
@@ -2753,7 +2734,7 @@
               <w:lang w:val="en-MX"/>
             </w:rPr>
           </w:pPr>
-          <w:hyperlink w:anchor="_Toc230112852" w:history="1">
+          <w:hyperlink w:anchor="_Toc230301201" w:history="1">
             <w:r>
               <w:rPr>
                 <w:rStyle w:val="Hyperlink"/>
@@ -2780,7 +2761,7 @@
                 <w:noProof/>
                 <w:webHidden/>
               </w:rPr>
-              <w:instrText xml:space="preserve"> PAGEREF _Toc230112852 \h </w:instrText>
+              <w:instrText xml:space="preserve"> PAGEREF _Toc230301201 \h </w:instrText>
             </w:r>
             <w:r>
               <w:rPr>
@@ -2829,7 +2810,7 @@
               <w:lang w:val="en-MX"/>
             </w:rPr>
           </w:pPr>
-          <w:hyperlink w:anchor="_Toc230112853" w:history="1">
+          <w:hyperlink w:anchor="_Toc230301202" w:history="1">
             <w:r>
               <w:rPr>
                 <w:rStyle w:val="Hyperlink"/>
@@ -2856,7 +2837,7 @@
                 <w:noProof/>
                 <w:webHidden/>
               </w:rPr>
-              <w:instrText xml:space="preserve"> PAGEREF _Toc230112853 \h </w:instrText>
+              <w:instrText xml:space="preserve"> PAGEREF _Toc230301202 \h </w:instrText>
             </w:r>
             <w:r>
               <w:rPr>
@@ -2905,7 +2886,7 @@
               <w:lang w:val="en-MX"/>
             </w:rPr>
           </w:pPr>
-          <w:hyperlink w:anchor="_Toc230112854" w:history="1">
+          <w:hyperlink w:anchor="_Toc230301203" w:history="1">
             <w:r>
               <w:rPr>
                 <w:rStyle w:val="Hyperlink"/>
@@ -2932,7 +2913,7 @@
                 <w:noProof/>
                 <w:webHidden/>
               </w:rPr>
-              <w:instrText xml:space="preserve"> PAGEREF _Toc230112854 \h </w:instrText>
+              <w:instrText xml:space="preserve"> PAGEREF _Toc230301203 \h </w:instrText>
             </w:r>
             <w:r>
               <w:rPr>
@@ -2981,7 +2962,7 @@
               <w:lang w:val="en-MX"/>
             </w:rPr>
           </w:pPr>
-          <w:hyperlink w:anchor="_Toc230112855" w:history="1">
+          <w:hyperlink w:anchor="_Toc230301204" w:history="1">
             <w:r>
               <w:rPr>
                 <w:rStyle w:val="Hyperlink"/>
@@ -3008,7 +2989,7 @@
                 <w:noProof/>
                 <w:webHidden/>
               </w:rPr>
-              <w:instrText xml:space="preserve"> PAGEREF _Toc230112855 \h </w:instrText>
+              <w:instrText xml:space="preserve"> PAGEREF _Toc230301204 \h </w:instrText>
             </w:r>
             <w:r>
               <w:rPr>
@@ -3058,84 +3039,7 @@
               <w:lang w:val="en-MX"/>
             </w:rPr>
           </w:pPr>
-          <w:r>
-            <w:rPr>
-              <w:noProof/>
-            </w:rPr>
-            <w:lastRenderedPageBreak/>
-            <mc:AlternateContent>
-              <mc:Choice Requires="wps">
-                <w:drawing>
-                  <wp:anchor distT="0" distB="0" distL="114300" distR="114300" simplePos="0" relativeHeight="251660352" behindDoc="1" locked="0" layoutInCell="1" allowOverlap="1" wp14:anchorId="334AAE3A" wp14:editId="74A65B86">
-                    <wp:simplePos x="0" y="0"/>
-                    <wp:positionH relativeFrom="column">
-                      <wp:posOffset>-271463</wp:posOffset>
-                    </wp:positionH>
-                    <wp:positionV relativeFrom="paragraph">
-                      <wp:posOffset>-356870</wp:posOffset>
-                    </wp:positionV>
-                    <wp:extent cx="6209030" cy="8071104"/>
-                    <wp:effectExtent l="0" t="0" r="1270" b="6350"/>
-                    <wp:wrapNone/>
-                    <wp:docPr id="1982804649" name="Rectangle 25"/>
-                    <wp:cNvGraphicFramePr/>
-                    <a:graphic xmlns:a="http://schemas.openxmlformats.org/drawingml/2006/main">
-                      <a:graphicData uri="http://schemas.microsoft.com/office/word/2010/wordprocessingShape">
-                        <wps:wsp>
-                          <wps:cNvSpPr/>
-                          <wps:spPr>
-                            <a:xfrm>
-                              <a:off x="0" y="0"/>
-                              <a:ext cx="6209030" cy="8071104"/>
-                            </a:xfrm>
-                            <a:prstGeom prst="rect">
-                              <a:avLst/>
-                            </a:prstGeom>
-                            <a:solidFill>
-                              <a:schemeClr val="bg1">
-                                <a:lumMod val="95000"/>
-                              </a:schemeClr>
-                            </a:solidFill>
-                            <a:ln>
-                              <a:noFill/>
-                            </a:ln>
-                          </wps:spPr>
-                          <wps:style>
-                            <a:lnRef idx="2">
-                              <a:schemeClr val="accent1">
-                                <a:shade val="15000"/>
-                              </a:schemeClr>
-                            </a:lnRef>
-                            <a:fillRef idx="1">
-                              <a:schemeClr val="accent1"/>
-                            </a:fillRef>
-                            <a:effectRef idx="0">
-                              <a:schemeClr val="accent1"/>
-                            </a:effectRef>
-                            <a:fontRef idx="minor">
-                              <a:schemeClr val="lt1"/>
-                            </a:fontRef>
-                          </wps:style>
-                          <wps:bodyPr rot="0" spcFirstLastPara="0" vertOverflow="overflow" horzOverflow="overflow" vert="horz" wrap="square" lIns="91440" tIns="45720" rIns="91440" bIns="45720" numCol="1" spcCol="0" rtlCol="0" fromWordArt="0" anchor="ctr" anchorCtr="0" forceAA="0" compatLnSpc="1">
-                            <a:prstTxWarp prst="textNoShape">
-                              <a:avLst/>
-                            </a:prstTxWarp>
-                            <a:noAutofit/>
-                          </wps:bodyPr>
-                        </wps:wsp>
-                      </a:graphicData>
-                    </a:graphic>
-                  </wp:anchor>
-                </w:drawing>
-              </mc:Choice>
-              <mc:Fallback>
-                <w:pict>
-                  <v:rect w14:anchorId="624FDE11" id="Rectangle 25" o:spid="_x0000_s1026" style="position:absolute;margin-left:-21.4pt;margin-top:-28.1pt;width:488.9pt;height:635.5pt;z-index:-251656128;visibility:visible;mso-wrap-style:square;mso-wrap-distance-left:9pt;mso-wrap-distance-top:0;mso-wrap-distance-right:9pt;mso-wrap-distance-bottom:0;mso-position-horizontal:absolute;mso-position-horizontal-relative:text;mso-position-vertical:absolute;mso-position-vertical-relative:text;v-text-anchor:middle" o:gfxdata="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" fillcolor="#f2f2f2 [3052]" stroked="f" strokeweight="1pt"/>
-                </w:pict>
-              </mc:Fallback>
-            </mc:AlternateContent>
-          </w:r>
-          <w:hyperlink w:anchor="_Toc230112856" w:history="1">
+          <w:hyperlink w:anchor="_Toc230301205" w:history="1">
             <w:r>
               <w:rPr>
                 <w:rStyle w:val="Hyperlink"/>
@@ -3162,7 +3066,7 @@
                 <w:noProof/>
                 <w:webHidden/>
               </w:rPr>
-              <w:instrText xml:space="preserve"> PAGEREF _Toc230112856 \h </w:instrText>
+              <w:instrText xml:space="preserve"> PAGEREF _Toc230301205 \h </w:instrText>
             </w:r>
             <w:r>
               <w:rPr>
@@ -3211,7 +3115,7 @@
               <w:lang w:val="en-MX"/>
             </w:rPr>
           </w:pPr>
-          <w:hyperlink w:anchor="_Toc230112857" w:history="1">
+          <w:hyperlink w:anchor="_Toc230301206" w:history="1">
             <w:r>
               <w:rPr>
                 <w:rStyle w:val="Hyperlink"/>
@@ -3238,7 +3142,7 @@
                 <w:noProof/>
                 <w:webHidden/>
               </w:rPr>
-              <w:instrText xml:space="preserve"> PAGEREF _Toc230112857 \h </w:instrText>
+              <w:instrText xml:space="preserve"> PAGEREF _Toc230301206 \h </w:instrText>
             </w:r>
             <w:r>
               <w:rPr>
@@ -3287,7 +3191,7 @@
               <w:lang w:val="en-MX"/>
             </w:rPr>
           </w:pPr>
-          <w:hyperlink w:anchor="_Toc230112858" w:history="1">
+          <w:hyperlink w:anchor="_Toc230301207" w:history="1">
             <w:r>
               <w:rPr>
                 <w:rStyle w:val="Hyperlink"/>
@@ -3314,7 +3218,7 @@
                 <w:noProof/>
                 <w:webHidden/>
               </w:rPr>
-              <w:instrText xml:space="preserve"> PAGEREF _Toc230112858 \h </w:instrText>
+              <w:instrText xml:space="preserve"> PAGEREF _Toc230301207 \h </w:instrText>
             </w:r>
             <w:r>
               <w:rPr>
@@ -3363,7 +3267,7 @@
               <w:lang w:val="en-MX"/>
             </w:rPr>
           </w:pPr>
-          <w:hyperlink w:anchor="_Toc230112859" w:history="1">
+          <w:hyperlink w:anchor="_Toc230301208" w:history="1">
             <w:r>
               <w:rPr>
                 <w:rStyle w:val="Hyperlink"/>
@@ -3390,7 +3294,7 @@
                 <w:noProof/>
                 <w:webHidden/>
               </w:rPr>
-              <w:instrText xml:space="preserve"> PAGEREF _Toc230112859 \h </w:instrText>
+              <w:instrText xml:space="preserve"> PAGEREF _Toc230301208 \h </w:instrText>
             </w:r>
             <w:r>
               <w:rPr>
@@ -3439,7 +3343,7 @@
               <w:lang w:val="en-MX"/>
             </w:rPr>
           </w:pPr>
-          <w:hyperlink w:anchor="_Toc230112860" w:history="1">
+          <w:hyperlink w:anchor="_Toc230301209" w:history="1">
             <w:r>
               <w:rPr>
                 <w:rStyle w:val="Hyperlink"/>
@@ -3466,7 +3370,7 @@
                 <w:noProof/>
                 <w:webHidden/>
               </w:rPr>
-              <w:instrText xml:space="preserve"> PAGEREF _Toc230112860 \h </w:instrText>
+              <w:instrText xml:space="preserve"> PAGEREF _Toc230301209 \h </w:instrText>
             </w:r>
             <w:r>
               <w:rPr>
@@ -3515,7 +3419,7 @@
               <w:lang w:val="en-MX"/>
             </w:rPr>
           </w:pPr>
-          <w:hyperlink w:anchor="_Toc230112861" w:history="1">
+          <w:hyperlink w:anchor="_Toc230301210" w:history="1">
             <w:r>
               <w:rPr>
                 <w:rStyle w:val="Hyperlink"/>
@@ -3542,7 +3446,7 @@
                 <w:noProof/>
                 <w:webHidden/>
               </w:rPr>
-              <w:instrText xml:space="preserve"> PAGEREF _Toc230112861 \h </w:instrText>
+              <w:instrText xml:space="preserve"> PAGEREF _Toc230301210 \h </w:instrText>
             </w:r>
             <w:r>
               <w:rPr>
@@ -3591,7 +3495,7 @@
               <w:lang w:val="en-MX"/>
             </w:rPr>
           </w:pPr>
-          <w:hyperlink w:anchor="_Toc230112862" w:history="1">
+          <w:hyperlink w:anchor="_Toc230301211" w:history="1">
             <w:r>
               <w:rPr>
                 <w:rStyle w:val="Hyperlink"/>
@@ -3618,7 +3522,7 @@
                 <w:noProof/>
                 <w:webHidden/>
               </w:rPr>
-              <w:instrText xml:space="preserve"> PAGEREF _Toc230112862 \h </w:instrText>
+              <w:instrText xml:space="preserve"> PAGEREF _Toc230301211 \h </w:instrText>
             </w:r>
             <w:r>
               <w:rPr>
@@ -3668,12 +3572,317 @@
               <w:lang w:val="en-MX"/>
             </w:rPr>
           </w:pPr>
-          <w:hyperlink w:anchor="_Toc230112863" w:history="1">
+          <w:hyperlink w:anchor="_Toc230301212" w:history="1">
             <w:r>
               <w:rPr>
                 <w:rStyle w:val="Hyperlink"/>
                 <w:noProof/>
               </w:rPr>
+              <w:t>8. Plan del Proyecto</w:t>
+            </w:r>
+            <w:r>
+              <w:rPr>
+                <w:noProof/>
+                <w:webHidden/>
+              </w:rPr>
+              <w:tab/>
+            </w:r>
+            <w:r>
+              <w:rPr>
+                <w:noProof/>
+                <w:webHidden/>
+              </w:rPr>
+              <w:fldChar w:fldCharType="begin"/>
+            </w:r>
+            <w:r>
+              <w:rPr>
+                <w:noProof/>
+                <w:webHidden/>
+              </w:rPr>
+              <w:instrText xml:space="preserve"> PAGEREF _Toc230301212 \h </w:instrText>
+            </w:r>
+            <w:r>
+              <w:rPr>
+                <w:noProof/>
+                <w:webHidden/>
+              </w:rPr>
+            </w:r>
+            <w:r>
+              <w:rPr>
+                <w:noProof/>
+                <w:webHidden/>
+              </w:rPr>
+              <w:fldChar w:fldCharType="separate"/>
+            </w:r>
+            <w:r>
+              <w:rPr>
+                <w:noProof/>
+                <w:webHidden/>
+              </w:rPr>
+              <w:t>19</w:t>
+            </w:r>
+            <w:r>
+              <w:rPr>
+                <w:noProof/>
+                <w:webHidden/>
+              </w:rPr>
+              <w:fldChar w:fldCharType="end"/>
+            </w:r>
+          </w:hyperlink>
+        </w:p>
+        <w:p>
+          <w:pPr>
+            <w:pStyle w:val="TOC2"/>
+            <w:tabs>
+              <w:tab w:val="right" w:pos="8828"/>
+            </w:tabs>
+            <w:rPr>
+              <w:rFonts w:eastAsiaTheme="minorEastAsia"/>
+              <w:b w:val="0"/>
+              <w:bCs w:val="0"/>
+              <w:smallCaps w:val="0"/>
+              <w:noProof/>
+              <w:kern w:val="2"/>
+              <w:sz w:val="24"/>
+              <w:szCs w:val="24"/>
+              <w:lang w:val="en-MX"/>
+            </w:rPr>
+          </w:pPr>
+          <w:hyperlink w:anchor="_Toc230301213" w:history="1">
+            <w:r>
+              <w:rPr>
+                <w:rStyle w:val="Hyperlink"/>
+                <w:noProof/>
+              </w:rPr>
+              <w:t>8.1 EDT (Estructura de Desglose del Trabajo)</w:t>
+            </w:r>
+            <w:r>
+              <w:rPr>
+                <w:noProof/>
+                <w:webHidden/>
+              </w:rPr>
+              <w:tab/>
+            </w:r>
+            <w:r>
+              <w:rPr>
+                <w:noProof/>
+                <w:webHidden/>
+              </w:rPr>
+              <w:fldChar w:fldCharType="begin"/>
+            </w:r>
+            <w:r>
+              <w:rPr>
+                <w:noProof/>
+                <w:webHidden/>
+              </w:rPr>
+              <w:instrText xml:space="preserve"> PAGEREF _Toc230301213 \h </w:instrText>
+            </w:r>
+            <w:r>
+              <w:rPr>
+                <w:noProof/>
+                <w:webHidden/>
+              </w:rPr>
+            </w:r>
+            <w:r>
+              <w:rPr>
+                <w:noProof/>
+                <w:webHidden/>
+              </w:rPr>
+              <w:fldChar w:fldCharType="separate"/>
+            </w:r>
+            <w:r>
+              <w:rPr>
+                <w:noProof/>
+                <w:webHidden/>
+              </w:rPr>
+              <w:t>19</w:t>
+            </w:r>
+            <w:r>
+              <w:rPr>
+                <w:noProof/>
+                <w:webHidden/>
+              </w:rPr>
+              <w:fldChar w:fldCharType="end"/>
+            </w:r>
+          </w:hyperlink>
+        </w:p>
+        <w:p>
+          <w:pPr>
+            <w:pStyle w:val="TOC2"/>
+            <w:tabs>
+              <w:tab w:val="right" w:pos="8828"/>
+            </w:tabs>
+            <w:rPr>
+              <w:rFonts w:eastAsiaTheme="minorEastAsia"/>
+              <w:b w:val="0"/>
+              <w:bCs w:val="0"/>
+              <w:smallCaps w:val="0"/>
+              <w:noProof/>
+              <w:kern w:val="2"/>
+              <w:sz w:val="24"/>
+              <w:szCs w:val="24"/>
+              <w:lang w:val="en-MX"/>
+            </w:rPr>
+          </w:pPr>
+          <w:hyperlink w:anchor="_Toc230301214" w:history="1">
+            <w:r>
+              <w:rPr>
+                <w:rStyle w:val="Hyperlink"/>
+                <w:noProof/>
+              </w:rPr>
+              <w:t>8.2 Cronograma</w:t>
+            </w:r>
+            <w:r>
+              <w:rPr>
+                <w:noProof/>
+                <w:webHidden/>
+              </w:rPr>
+              <w:tab/>
+            </w:r>
+            <w:r>
+              <w:rPr>
+                <w:noProof/>
+                <w:webHidden/>
+              </w:rPr>
+              <w:fldChar w:fldCharType="begin"/>
+            </w:r>
+            <w:r>
+              <w:rPr>
+                <w:noProof/>
+                <w:webHidden/>
+              </w:rPr>
+              <w:instrText xml:space="preserve"> PAGEREF _Toc230301214 \h </w:instrText>
+            </w:r>
+            <w:r>
+              <w:rPr>
+                <w:noProof/>
+                <w:webHidden/>
+              </w:rPr>
+            </w:r>
+            <w:r>
+              <w:rPr>
+                <w:noProof/>
+                <w:webHidden/>
+              </w:rPr>
+              <w:fldChar w:fldCharType="separate"/>
+            </w:r>
+            <w:r>
+              <w:rPr>
+                <w:noProof/>
+                <w:webHidden/>
+              </w:rPr>
+              <w:t>20</w:t>
+            </w:r>
+            <w:r>
+              <w:rPr>
+                <w:noProof/>
+                <w:webHidden/>
+              </w:rPr>
+              <w:fldChar w:fldCharType="end"/>
+            </w:r>
+          </w:hyperlink>
+        </w:p>
+        <w:p>
+          <w:pPr>
+            <w:pStyle w:val="TOC2"/>
+            <w:tabs>
+              <w:tab w:val="right" w:pos="8828"/>
+            </w:tabs>
+            <w:rPr>
+              <w:rFonts w:eastAsiaTheme="minorEastAsia"/>
+              <w:b w:val="0"/>
+              <w:bCs w:val="0"/>
+              <w:smallCaps w:val="0"/>
+              <w:noProof/>
+              <w:kern w:val="2"/>
+              <w:sz w:val="24"/>
+              <w:szCs w:val="24"/>
+              <w:lang w:val="en-MX"/>
+            </w:rPr>
+          </w:pPr>
+          <w:hyperlink w:anchor="_Toc230301215" w:history="1">
+            <w:r>
+              <w:rPr>
+                <w:rStyle w:val="Hyperlink"/>
+                <w:noProof/>
+              </w:rPr>
+              <w:t>8.3 Roles del Equipo</w:t>
+            </w:r>
+            <w:r>
+              <w:rPr>
+                <w:noProof/>
+                <w:webHidden/>
+              </w:rPr>
+              <w:tab/>
+            </w:r>
+            <w:r>
+              <w:rPr>
+                <w:noProof/>
+                <w:webHidden/>
+              </w:rPr>
+              <w:fldChar w:fldCharType="begin"/>
+            </w:r>
+            <w:r>
+              <w:rPr>
+                <w:noProof/>
+                <w:webHidden/>
+              </w:rPr>
+              <w:instrText xml:space="preserve"> PAGEREF _Toc230301215 \h </w:instrText>
+            </w:r>
+            <w:r>
+              <w:rPr>
+                <w:noProof/>
+                <w:webHidden/>
+              </w:rPr>
+            </w:r>
+            <w:r>
+              <w:rPr>
+                <w:noProof/>
+                <w:webHidden/>
+              </w:rPr>
+              <w:fldChar w:fldCharType="separate"/>
+            </w:r>
+            <w:r>
+              <w:rPr>
+                <w:noProof/>
+                <w:webHidden/>
+              </w:rPr>
+              <w:t>22</w:t>
+            </w:r>
+            <w:r>
+              <w:rPr>
+                <w:noProof/>
+                <w:webHidden/>
+              </w:rPr>
+              <w:fldChar w:fldCharType="end"/>
+            </w:r>
+          </w:hyperlink>
+        </w:p>
+        <w:p>
+          <w:pPr>
+            <w:pStyle w:val="TOC1"/>
+            <w:tabs>
+              <w:tab w:val="right" w:pos="8828"/>
+            </w:tabs>
+            <w:rPr>
+              <w:rFonts w:eastAsiaTheme="minorEastAsia"/>
+              <w:b w:val="0"/>
+              <w:bCs w:val="0"/>
+              <w:caps w:val="0"/>
+              <w:noProof/>
+              <w:kern w:val="2"/>
+              <w:sz w:val="24"/>
+              <w:szCs w:val="24"/>
+              <w:u w:val="none"/>
+              <w:lang w:val="en-MX"/>
+            </w:rPr>
+          </w:pPr>
+          <w:hyperlink w:anchor="_Toc230301216" w:history="1">
+            <w:r>
+              <w:rPr>
+                <w:rStyle w:val="Hyperlink"/>
+                <w:noProof/>
+              </w:rPr>
               <w:t>14. Anexos</w:t>
             </w:r>
             <w:r>
@@ -3695,7 +3904,7 @@
                 <w:noProof/>
                 <w:webHidden/>
               </w:rPr>
-              <w:instrText xml:space="preserve"> PAGEREF _Toc230112863 \h </w:instrText>
+              <w:instrText xml:space="preserve"> PAGEREF _Toc230301216 \h </w:instrText>
             </w:r>
             <w:r>
               <w:rPr>
@@ -3715,7 +3924,7 @@
                 <w:noProof/>
                 <w:webHidden/>
               </w:rPr>
-              <w:t>19</w:t>
+              <w:t>23</w:t>
             </w:r>
             <w:r>
               <w:rPr>
@@ -3760,15 +3969,12 @@
         <w:spacing w:line="276" w:lineRule="auto"/>
       </w:pPr>
     </w:p>
-    <w:bookmarkStart w:id="0" w:name="_Toc230112832"/>
+    <w:bookmarkStart w:id="0" w:name="_Toc230301181"/>
     <w:p>
       <w:pPr>
         <w:pStyle w:val="Heading1"/>
       </w:pPr>
       <w:r>
-        <w:rPr>
-          <w:noProof/>
-        </w:rPr>
         <mc:AlternateContent>
           <mc:Choice Requires="wps">
             <w:drawing>
@@ -3854,9 +4060,6 @@
         </mc:AlternateContent>
       </w:r>
       <w:r>
-        <w:rPr>
-          <w:noProof/>
-        </w:rPr>
         <mc:AlternateContent>
           <mc:Choice Requires="wps">
             <w:drawing>
@@ -3953,7 +4156,7 @@
       <w:bookmarkEnd w:id="0"/>
     </w:p>
     <w:p/>
-    <w:bookmarkStart w:id="1" w:name="_Toc230112833"/>
+    <w:bookmarkStart w:id="1" w:name="_Toc230301182"/>
     <w:p>
       <w:pPr>
         <w:pStyle w:val="Heading2"/>
@@ -4292,7 +4495,7 @@
         </w:rPr>
       </w:pPr>
     </w:p>
-    <w:bookmarkStart w:id="2" w:name="_Toc230112834"/>
+    <w:bookmarkStart w:id="2" w:name="_Toc230301183"/>
     <w:p>
       <w:pPr>
         <w:pStyle w:val="Heading2"/>
@@ -4622,7 +4825,7 @@
         </w:rPr>
       </w:pPr>
     </w:p>
-    <w:bookmarkStart w:id="3" w:name="_Toc230112835"/>
+    <w:bookmarkStart w:id="3" w:name="_Toc230301184"/>
     <w:p>
       <w:pPr>
         <w:pStyle w:val="Heading2"/>
@@ -4776,7 +4979,7 @@
         </w:rPr>
       </w:pPr>
     </w:p>
-    <w:bookmarkStart w:id="4" w:name="_Toc230112836"/>
+    <w:bookmarkStart w:id="4" w:name="_Toc230301185"/>
     <w:p>
       <w:pPr>
         <w:pStyle w:val="Heading2"/>
@@ -5071,7 +5274,7 @@
         </mc:AlternateContent>
       </w:r>
     </w:p>
-    <w:bookmarkStart w:id="5" w:name="_Toc230112837"/>
+    <w:bookmarkStart w:id="5" w:name="_Toc230301186"/>
     <w:p>
       <w:pPr>
         <w:pStyle w:val="Heading1"/>
@@ -5080,11 +5283,6 @@
         </w:rPr>
       </w:pPr>
       <w:r>
-        <w:rPr>
-          <w:noProof/>
-          <w:sz w:val="44"/>
-          <w:szCs w:val="40"/>
-        </w:rPr>
         <mc:AlternateContent>
           <mc:Choice Requires="wps">
             <w:drawing>
@@ -5170,10 +5368,6 @@
         </mc:AlternateContent>
       </w:r>
       <w:r>
-        <w:rPr>
-          <w:sz w:val="44"/>
-          <w:szCs w:val="40"/>
-        </w:rPr>
         <w:t>2</w:t>
       </w:r>
       <w:r>
@@ -5185,7 +5379,7 @@
       <w:bookmarkEnd w:id="5"/>
     </w:p>
     <w:p/>
-    <w:bookmarkStart w:id="6" w:name="_Toc230112838"/>
+    <w:bookmarkStart w:id="6" w:name="_Toc230301187"/>
     <w:p>
       <w:pPr>
         <w:pStyle w:val="Heading2"/>
@@ -5320,7 +5514,7 @@
         </w:rPr>
       </w:pPr>
     </w:p>
-    <w:bookmarkStart w:id="7" w:name="_Toc230112839"/>
+    <w:bookmarkStart w:id="7" w:name="_Toc230301188"/>
     <w:p>
       <w:pPr>
         <w:pStyle w:val="Heading2"/>
@@ -5741,7 +5935,7 @@
         </w:rPr>
       </w:pPr>
     </w:p>
-    <w:bookmarkStart w:id="8" w:name="_Toc230112840"/>
+    <w:bookmarkStart w:id="8" w:name="_Toc230301189"/>
     <w:p>
       <w:pPr>
         <w:pStyle w:val="Heading2"/>
@@ -5931,7 +6125,7 @@
         </w:rPr>
       </w:pPr>
     </w:p>
-    <w:bookmarkStart w:id="9" w:name="_Toc230112841"/>
+    <w:bookmarkStart w:id="9" w:name="_Toc230301190"/>
     <w:p>
       <w:pPr>
         <w:pStyle w:val="Heading2"/>
@@ -6265,7 +6459,7 @@
         </mc:AlternateContent>
       </w:r>
     </w:p>
-    <w:bookmarkStart w:id="10" w:name="_Toc230112842"/>
+    <w:bookmarkStart w:id="10" w:name="_Toc230301191"/>
     <w:p>
       <w:pPr>
         <w:pStyle w:val="Heading1"/>
@@ -6274,11 +6468,6 @@
         </w:rPr>
       </w:pPr>
       <w:r>
-        <w:rPr>
-          <w:noProof/>
-          <w:sz w:val="44"/>
-          <w:szCs w:val="40"/>
-        </w:rPr>
         <mc:AlternateContent>
           <mc:Choice Requires="wps">
             <w:drawing>
@@ -6364,17 +6553,9 @@
         </mc:AlternateContent>
       </w:r>
       <w:r>
-        <w:rPr>
-          <w:sz w:val="44"/>
-          <w:szCs w:val="40"/>
-        </w:rPr>
         <w:t xml:space="preserve">3. </w:t>
       </w:r>
       <w:r>
-        <w:rPr>
-          <w:sz w:val="44"/>
-          <w:szCs w:val="40"/>
-        </w:rPr>
         <w:t>Análisis del Negocio</w:t>
       </w:r>
       <w:bookmarkEnd w:id="10"/>
@@ -6386,7 +6567,7 @@
         </w:rPr>
       </w:pPr>
     </w:p>
-    <w:bookmarkStart w:id="11" w:name="_Toc230112843"/>
+    <w:bookmarkStart w:id="11" w:name="_Toc230301192"/>
     <w:p>
       <w:pPr>
         <w:pStyle w:val="Heading2"/>
@@ -6732,7 +6913,7 @@
         </w:rPr>
       </w:pPr>
     </w:p>
-    <w:bookmarkStart w:id="12" w:name="_Toc230112844"/>
+    <w:bookmarkStart w:id="12" w:name="_Toc230301193"/>
     <w:p>
       <w:pPr>
         <w:pStyle w:val="Heading2"/>
@@ -7162,7 +7343,7 @@
         </w:rPr>
       </w:pPr>
     </w:p>
-    <w:bookmarkStart w:id="13" w:name="_Toc230112845"/>
+    <w:bookmarkStart w:id="13" w:name="_Toc230301194"/>
     <w:p>
       <w:pPr>
         <w:pStyle w:val="Heading2"/>
@@ -7644,7 +7825,7 @@
         </mc:AlternateContent>
       </w:r>
     </w:p>
-    <w:bookmarkStart w:id="14" w:name="_Toc230112846"/>
+    <w:bookmarkStart w:id="14" w:name="_Toc230301195"/>
     <w:p>
       <w:pPr>
         <w:pStyle w:val="Heading1"/>
@@ -7653,11 +7834,6 @@
         </w:rPr>
       </w:pPr>
       <w:r>
-        <w:rPr>
-          <w:noProof/>
-          <w:sz w:val="44"/>
-          <w:szCs w:val="40"/>
-        </w:rPr>
         <mc:AlternateContent>
           <mc:Choice Requires="wps">
             <w:drawing>
@@ -7743,10 +7919,6 @@
         </mc:AlternateContent>
       </w:r>
       <w:r>
-        <w:rPr>
-          <w:sz w:val="44"/>
-          <w:szCs w:val="40"/>
-        </w:rPr>
         <w:t>4. Factibilidad</w:t>
       </w:r>
       <w:bookmarkEnd w:id="14"/>
@@ -7758,7 +7930,7 @@
         </w:rPr>
       </w:pPr>
     </w:p>
-    <w:bookmarkStart w:id="15" w:name="_Toc230112847"/>
+    <w:bookmarkStart w:id="15" w:name="_Toc230301196"/>
     <w:p>
       <w:pPr>
         <w:pStyle w:val="Heading2"/>
@@ -7874,8 +8046,18 @@
       <w:pPr>
         <w:ind w:firstLine="708"/>
         <w:jc w:val="both"/>
-      </w:pPr>
-      <w:r>
+        <w:rPr>
+          <w:rFonts w:ascii="Baskerville" w:hAnsi="Baskerville"/>
+          <w:sz w:val="24"/>
+          <w:szCs w:val="24"/>
+        </w:rPr>
+      </w:pPr>
+      <w:r>
+        <w:rPr>
+          <w:rFonts w:ascii="Baskerville" w:hAnsi="Baskerville"/>
+          <w:sz w:val="24"/>
+          <w:szCs w:val="24"/>
+        </w:rPr>
         <w:t>Actualmente, la empresa dispone de computadoras en el área administrativa (Office Members) y dispositivos móviles utilizados por los empleados operativos (Drivers), además de conexión a internet para la gestión diaria de sus actividades. El sistema propuesto será una plataforma web, lo que significa que no requiere instalación de software especializado en cada equipo, sino únicamente acceso mediante navegador y conexión a internet, lo cual facilita su implementación.</w:t>
       </w:r>
     </w:p>
@@ -7883,8 +8065,18 @@
       <w:pPr>
         <w:ind w:firstLine="708"/>
         <w:jc w:val="both"/>
-      </w:pPr>
-      <w:r>
+        <w:rPr>
+          <w:rFonts w:ascii="Baskerville" w:hAnsi="Baskerville"/>
+          <w:sz w:val="24"/>
+          <w:szCs w:val="24"/>
+        </w:rPr>
+      </w:pPr>
+      <w:r>
+        <w:rPr>
+          <w:rFonts w:ascii="Baskerville" w:hAnsi="Baskerville"/>
+          <w:sz w:val="24"/>
+          <w:szCs w:val="24"/>
+        </w:rPr>
         <w:lastRenderedPageBreak/>
         <w:t>Desde el punto de vista tecnológico, no se requiere hardware avanzado ni infraestructura compleja. El sistema podrá alojarse en un servidor en la nube, garantizando disponibilidad, almacenamiento seguro de la información y respaldo de datos. Asimismo, el uso de una base de datos centralizada permitirá que la información esté actualizada en tiempo real, reduciendo inconsistencias y errores derivados del manejo manual.</w:t>
       </w:r>
@@ -7894,7 +8086,7 @@
         <w:jc w:val="both"/>
       </w:pPr>
     </w:p>
-    <w:bookmarkStart w:id="16" w:name="_Toc230112848"/>
+    <w:bookmarkStart w:id="16" w:name="_Toc230301197"/>
     <w:p>
       <w:pPr>
         <w:pStyle w:val="Heading2"/>
@@ -8010,12 +8202,18 @@
       <w:pPr>
         <w:ind w:firstLine="708"/>
         <w:rPr>
+          <w:rFonts w:ascii="Baskerville" w:hAnsi="Baskerville"/>
           <w:bCs/>
-        </w:rPr>
-      </w:pPr>
-      <w:r>
-        <w:rPr>
+          <w:sz w:val="24"/>
+          <w:szCs w:val="24"/>
+        </w:rPr>
+      </w:pPr>
+      <w:r>
+        <w:rPr>
+          <w:rFonts w:ascii="Baskerville" w:hAnsi="Baskerville"/>
           <w:bCs/>
+          <w:sz w:val="24"/>
+          <w:szCs w:val="24"/>
         </w:rPr>
         <w:t>En cuanto a los costos iniciales, el proyecto no requiere una inversión elevada en hardware, ya que la empresa ya cuenta con computadoras en el área administrativa y dispositivos móviles utilizados por los empleados operativos. El sistema será desarrollado como parte del proyecto académico, por lo que no se contempla un costo directo de desarrollo externo. Sin embargo, podrían considerarse gastos relacionados con hosting en la nube, dominio web y configuración inicial del sistema.</w:t>
       </w:r>
@@ -8023,18 +8221,24 @@
     <w:p>
       <w:pPr>
         <w:rPr>
+          <w:rFonts w:ascii="Baskerville" w:hAnsi="Baskerville"/>
           <w:bCs/>
-        </w:rPr>
-      </w:pPr>
-      <w:r>
-        <w:rPr>
+          <w:sz w:val="24"/>
+          <w:szCs w:val="24"/>
+        </w:rPr>
+      </w:pPr>
+      <w:r>
+        <w:rPr>
+          <w:rFonts w:ascii="Baskerville" w:hAnsi="Baskerville"/>
           <w:bCs/>
+          <w:sz w:val="24"/>
+          <w:szCs w:val="24"/>
         </w:rPr>
         <w:t>Respecto a los costos de operación y mantenimiento, estos incluirán el pago anual del servidor, posibles actualizaciones del sistema y soporte técnico básico. Estos costos son relativamente bajos en comparación con los beneficios esperados, ya que el sistema estará basado en tecnología web estándar y no requerirá infraestructura especializada.</w:t>
       </w:r>
     </w:p>
     <w:p/>
-    <w:bookmarkStart w:id="17" w:name="_Toc230112849"/>
+    <w:bookmarkStart w:id="17" w:name="_Toc230301198"/>
     <w:p>
       <w:pPr>
         <w:pStyle w:val="Heading2"/>
@@ -8150,14 +8354,34 @@
       <w:pPr>
         <w:ind w:firstLine="708"/>
         <w:jc w:val="both"/>
-      </w:pPr>
-      <w:r>
+        <w:rPr>
+          <w:rFonts w:ascii="Baskerville" w:hAnsi="Baskerville"/>
+          <w:sz w:val="24"/>
+          <w:szCs w:val="24"/>
+        </w:rPr>
+      </w:pPr>
+      <w:r>
+        <w:rPr>
+          <w:rFonts w:ascii="Baskerville" w:hAnsi="Baskerville"/>
+          <w:sz w:val="24"/>
+          <w:szCs w:val="24"/>
+        </w:rPr>
         <w:t xml:space="preserve">La gran demanda de ordenes en la empresa provoca una saturación para los miembros de Office los cuales operan y administran a los </w:t>
       </w:r>
       <w:r>
+        <w:rPr>
+          <w:rFonts w:ascii="Baskerville" w:hAnsi="Baskerville"/>
+          <w:sz w:val="24"/>
+          <w:szCs w:val="24"/>
+        </w:rPr>
         <w:t>empleados,</w:t>
       </w:r>
       <w:r>
+        <w:rPr>
+          <w:rFonts w:ascii="Baskerville" w:hAnsi="Baskerville"/>
+          <w:sz w:val="24"/>
+          <w:szCs w:val="24"/>
+        </w:rPr>
         <w:t xml:space="preserve"> así como distribuyen las ordenes de clientes a estos empleados. El sistema resultara factible si dichos administradores perciben mayor claridad y eficiencia en sus procesos a la hora de abordar dichas ordenes, ya que, además estaremos digitalizando sus procesos y reduciendo errores humanos.</w:t>
       </w:r>
     </w:p>
@@ -8265,7 +8489,6 @@
           <w:sz w:val="36"/>
           <w:szCs w:val="32"/>
         </w:rPr>
-        <w:lastRenderedPageBreak/>
         <mc:AlternateContent>
           <mc:Choice Requires="wps">
             <w:drawing>
@@ -8351,7 +8574,7 @@
         </mc:AlternateContent>
       </w:r>
     </w:p>
-    <w:bookmarkStart w:id="18" w:name="_Toc230112850"/>
+    <w:bookmarkStart w:id="18" w:name="_Toc230301199"/>
     <w:p>
       <w:pPr>
         <w:pStyle w:val="Heading1"/>
@@ -8360,11 +8583,6 @@
         </w:rPr>
       </w:pPr>
       <w:r>
-        <w:rPr>
-          <w:noProof/>
-          <w:sz w:val="44"/>
-          <w:szCs w:val="40"/>
-        </w:rPr>
         <mc:AlternateContent>
           <mc:Choice Requires="wps">
             <w:drawing>
@@ -8450,10 +8668,6 @@
         </mc:AlternateContent>
       </w:r>
       <w:r>
-        <w:rPr>
-          <w:sz w:val="44"/>
-          <w:szCs w:val="40"/>
-        </w:rPr>
         <w:t>5. Requerimientos</w:t>
       </w:r>
       <w:bookmarkEnd w:id="18"/>
@@ -8465,7 +8679,7 @@
         </w:rPr>
       </w:pPr>
     </w:p>
-    <w:bookmarkStart w:id="19" w:name="_Toc230112851"/>
+    <w:bookmarkStart w:id="19" w:name="_Toc230301200"/>
     <w:p>
       <w:pPr>
         <w:pStyle w:val="Heading2"/>
@@ -8692,7 +8906,6 @@
           <w:sz w:val="36"/>
           <w:szCs w:val="32"/>
         </w:rPr>
-        <w:lastRenderedPageBreak/>
         <mc:AlternateContent>
           <mc:Choice Requires="wps">
             <w:drawing>
@@ -8778,7 +8991,7 @@
         </mc:AlternateContent>
       </w:r>
     </w:p>
-    <w:bookmarkStart w:id="20" w:name="_Toc230112852"/>
+    <w:bookmarkStart w:id="20" w:name="_Toc230301201"/>
     <w:p>
       <w:pPr>
         <w:pStyle w:val="Heading1"/>
@@ -8787,11 +9000,6 @@
         </w:rPr>
       </w:pPr>
       <w:r>
-        <w:rPr>
-          <w:noProof/>
-          <w:sz w:val="44"/>
-          <w:szCs w:val="40"/>
-        </w:rPr>
         <mc:AlternateContent>
           <mc:Choice Requires="wps">
             <w:drawing>
@@ -8877,17 +9085,9 @@
         </mc:AlternateContent>
       </w:r>
       <w:r>
-        <w:rPr>
-          <w:sz w:val="44"/>
-          <w:szCs w:val="40"/>
-        </w:rPr>
         <w:t xml:space="preserve">6. </w:t>
       </w:r>
       <w:r>
-        <w:rPr>
-          <w:sz w:val="44"/>
-          <w:szCs w:val="40"/>
-        </w:rPr>
         <w:t>Metodologías</w:t>
       </w:r>
       <w:bookmarkEnd w:id="20"/>
@@ -8899,7 +9099,7 @@
         </w:rPr>
       </w:pPr>
     </w:p>
-    <w:bookmarkStart w:id="21" w:name="_Toc230112853"/>
+    <w:bookmarkStart w:id="21" w:name="_Toc230301202"/>
     <w:p>
       <w:pPr>
         <w:pStyle w:val="Heading2"/>
@@ -9017,61 +9217,17 @@
         <w:jc w:val="both"/>
         <w:rPr>
           <w:rFonts w:ascii="Baskerville" w:hAnsi="Baskerville"/>
-        </w:rPr>
-      </w:pPr>
-      <w:r>
-        <w:rPr>
-          <w:rFonts w:ascii="Baskerville" w:hAnsi="Baskerville"/>
-        </w:rPr>
-        <w:t>Para el desarrollo del sistema, el equipo de proyecto ha decidido implementar una</w:t>
-      </w:r>
-      <w:r>
-        <w:rPr>
-          <w:rFonts w:ascii="Baskerville" w:hAnsi="Baskerville"/>
-        </w:rPr>
-        <w:t xml:space="preserve"> </w:t>
-      </w:r>
-      <w:r>
-        <w:rPr>
-          <w:rFonts w:ascii="Baskerville" w:hAnsi="Baskerville"/>
-        </w:rPr>
-        <w:t>metodología</w:t>
-      </w:r>
-      <w:r>
-        <w:rPr>
-          <w:rFonts w:ascii="Baskerville" w:hAnsi="Baskerville"/>
-        </w:rPr>
-        <w:t xml:space="preserve"> </w:t>
-      </w:r>
-      <w:r>
-        <w:rPr>
-          <w:rFonts w:ascii="Baskerville" w:hAnsi="Baskerville"/>
-        </w:rPr>
-        <w:t>híbrida basada en Scrum (enfoque ágil) combinada con elementos</w:t>
-      </w:r>
-      <w:r>
-        <w:rPr>
-          <w:rFonts w:ascii="Baskerville" w:hAnsi="Baskerville"/>
-        </w:rPr>
-        <w:t xml:space="preserve"> </w:t>
-      </w:r>
-      <w:r>
-        <w:rPr>
-          <w:rFonts w:ascii="Baskerville" w:hAnsi="Baskerville"/>
-        </w:rPr>
-        <w:t>estructurados del modelo Modelo</w:t>
-      </w:r>
-      <w:r>
-        <w:rPr>
-          <w:rFonts w:ascii="Baskerville" w:hAnsi="Baskerville"/>
-        </w:rPr>
-        <w:t xml:space="preserve"> </w:t>
-      </w:r>
-      <w:r>
-        <w:rPr>
-          <w:rFonts w:ascii="Baskerville" w:hAnsi="Baskerville"/>
-        </w:rPr>
-        <w:t>en Cascada.</w:t>
+          <w:sz w:val="24"/>
+          <w:szCs w:val="24"/>
+        </w:rPr>
+      </w:pPr>
+      <w:r>
+        <w:rPr>
+          <w:rFonts w:ascii="Baskerville" w:hAnsi="Baskerville"/>
+          <w:sz w:val="24"/>
+          <w:szCs w:val="24"/>
+        </w:rPr>
+        <w:t>Para el desarrollo del sistema, el equipo de proyecto ha decidido implementar una metodología híbrida basada en Scrum (enfoque ágil) combinada con elementos estructurados del modelo Modelo en Cascada.</w:t>
       </w:r>
     </w:p>
     <w:p>
@@ -9080,11 +9236,15 @@
         <w:jc w:val="both"/>
         <w:rPr>
           <w:rFonts w:ascii="Baskerville" w:hAnsi="Baskerville"/>
-        </w:rPr>
-      </w:pPr>
-      <w:r>
-        <w:rPr>
-          <w:rFonts w:ascii="Baskerville" w:hAnsi="Baskerville"/>
+          <w:sz w:val="24"/>
+          <w:szCs w:val="24"/>
+        </w:rPr>
+      </w:pPr>
+      <w:r>
+        <w:rPr>
+          <w:rFonts w:ascii="Baskerville" w:hAnsi="Baskerville"/>
+          <w:sz w:val="24"/>
+          <w:szCs w:val="24"/>
         </w:rPr>
         <w:t>Esta combinación permite:</w:t>
       </w:r>
@@ -9100,11 +9260,15 @@
         <w:jc w:val="both"/>
         <w:rPr>
           <w:rFonts w:ascii="Baskerville" w:hAnsi="Baskerville"/>
-        </w:rPr>
-      </w:pPr>
-      <w:r>
-        <w:rPr>
-          <w:rFonts w:ascii="Baskerville" w:hAnsi="Baskerville"/>
+          <w:sz w:val="24"/>
+          <w:szCs w:val="24"/>
+        </w:rPr>
+      </w:pPr>
+      <w:r>
+        <w:rPr>
+          <w:rFonts w:ascii="Baskerville" w:hAnsi="Baskerville"/>
+          <w:sz w:val="24"/>
+          <w:szCs w:val="24"/>
         </w:rPr>
         <w:t>Mantener una planeación formal y documentada.</w:t>
       </w:r>
@@ -9120,11 +9284,15 @@
         <w:jc w:val="both"/>
         <w:rPr>
           <w:rFonts w:ascii="Baskerville" w:hAnsi="Baskerville"/>
-        </w:rPr>
-      </w:pPr>
-      <w:r>
-        <w:rPr>
-          <w:rFonts w:ascii="Baskerville" w:hAnsi="Baskerville"/>
+          <w:sz w:val="24"/>
+          <w:szCs w:val="24"/>
+        </w:rPr>
+      </w:pPr>
+      <w:r>
+        <w:rPr>
+          <w:rFonts w:ascii="Baskerville" w:hAnsi="Baskerville"/>
+          <w:sz w:val="24"/>
+          <w:szCs w:val="24"/>
         </w:rPr>
         <w:t>Trabajar por iteraciones controladas.</w:t>
       </w:r>
@@ -9140,11 +9308,15 @@
         <w:jc w:val="both"/>
         <w:rPr>
           <w:rFonts w:ascii="Baskerville" w:hAnsi="Baskerville"/>
-        </w:rPr>
-      </w:pPr>
-      <w:r>
-        <w:rPr>
-          <w:rFonts w:ascii="Baskerville" w:hAnsi="Baskerville"/>
+          <w:sz w:val="24"/>
+          <w:szCs w:val="24"/>
+        </w:rPr>
+      </w:pPr>
+      <w:r>
+        <w:rPr>
+          <w:rFonts w:ascii="Baskerville" w:hAnsi="Baskerville"/>
+          <w:sz w:val="24"/>
+          <w:szCs w:val="24"/>
         </w:rPr>
         <w:t>Adaptarse a cambios en los requerimientos.</w:t>
       </w:r>
@@ -9160,11 +9332,15 @@
         <w:jc w:val="both"/>
         <w:rPr>
           <w:rFonts w:ascii="Baskerville" w:hAnsi="Baskerville"/>
-        </w:rPr>
-      </w:pPr>
-      <w:r>
-        <w:rPr>
-          <w:rFonts w:ascii="Baskerville" w:hAnsi="Baskerville"/>
+          <w:sz w:val="24"/>
+          <w:szCs w:val="24"/>
+        </w:rPr>
+      </w:pPr>
+      <w:r>
+        <w:rPr>
+          <w:rFonts w:ascii="Baskerville" w:hAnsi="Baskerville"/>
+          <w:sz w:val="24"/>
+          <w:szCs w:val="24"/>
         </w:rPr>
         <w:t>Entregar avances funcionales parciales del sistema.</w:t>
       </w:r>
@@ -9180,11 +9356,15 @@
         <w:jc w:val="both"/>
         <w:rPr>
           <w:rFonts w:ascii="Baskerville" w:hAnsi="Baskerville"/>
-        </w:rPr>
-      </w:pPr>
-      <w:r>
-        <w:rPr>
-          <w:rFonts w:ascii="Baskerville" w:hAnsi="Baskerville"/>
+          <w:sz w:val="24"/>
+          <w:szCs w:val="24"/>
+        </w:rPr>
+      </w:pPr>
+      <w:r>
+        <w:rPr>
+          <w:rFonts w:ascii="Baskerville" w:hAnsi="Baskerville"/>
+          <w:sz w:val="24"/>
+          <w:szCs w:val="24"/>
         </w:rPr>
         <w:t>Reducir riesgos técnicos y organizacionales.</w:t>
       </w:r>
@@ -9193,10 +9373,12 @@
       <w:pPr>
         <w:rPr>
           <w:rFonts w:ascii="Baskerville" w:hAnsi="Baskerville"/>
-        </w:rPr>
-      </w:pPr>
-    </w:p>
-    <w:bookmarkStart w:id="22" w:name="_Toc230112854"/>
+          <w:sz w:val="24"/>
+          <w:szCs w:val="24"/>
+        </w:rPr>
+      </w:pPr>
+    </w:p>
+    <w:bookmarkStart w:id="22" w:name="_Toc230301203"/>
     <w:p>
       <w:pPr>
         <w:pStyle w:val="Heading2"/>
@@ -9673,6 +9855,7 @@
           <w:sz w:val="24"/>
           <w:szCs w:val="24"/>
         </w:rPr>
+        <w:lastRenderedPageBreak/>
         <w:t>Documentación clara desde el inicio.</w:t>
       </w:r>
     </w:p>
@@ -9697,7 +9880,6 @@
           <w:sz w:val="24"/>
           <w:szCs w:val="24"/>
         </w:rPr>
-        <w:lastRenderedPageBreak/>
         <w:t>Definición formal de fases.</w:t>
       </w:r>
     </w:p>
@@ -9756,7 +9938,7 @@
         </w:rPr>
       </w:pPr>
     </w:p>
-    <w:bookmarkStart w:id="23" w:name="_Toc230112855"/>
+    <w:bookmarkStart w:id="23" w:name="_Toc230301204"/>
     <w:p>
       <w:pPr>
         <w:pStyle w:val="Heading2"/>
@@ -10421,6 +10603,7 @@
           <w:sz w:val="24"/>
           <w:szCs w:val="24"/>
         </w:rPr>
+        <w:lastRenderedPageBreak/>
         <w:t>Documento de especificación de requerimientos.</w:t>
       </w:r>
     </w:p>
@@ -10445,7 +10628,6 @@
           <w:sz w:val="24"/>
           <w:szCs w:val="24"/>
         </w:rPr>
-        <w:lastRenderedPageBreak/>
         <w:t>Lista priorizada de funcionalidades (Product Backlog).</w:t>
       </w:r>
     </w:p>
@@ -11110,6 +11292,7 @@
           <w:sz w:val="24"/>
           <w:szCs w:val="24"/>
         </w:rPr>
+        <w:lastRenderedPageBreak/>
         <w:t>Reporte de avance.</w:t>
       </w:r>
     </w:p>
@@ -11135,7 +11318,6 @@
           <w:sz w:val="24"/>
           <w:szCs w:val="24"/>
         </w:rPr>
-        <w:lastRenderedPageBreak/>
         <w:t>Registro de incidencias.</w:t>
       </w:r>
     </w:p>
@@ -11825,7 +12007,7 @@
         </mc:AlternateContent>
       </w:r>
     </w:p>
-    <w:bookmarkStart w:id="24" w:name="_Toc230112856"/>
+    <w:bookmarkStart w:id="24" w:name="_Toc230301205"/>
     <w:p>
       <w:pPr>
         <w:pStyle w:val="Heading1"/>
@@ -11834,11 +12016,6 @@
         </w:rPr>
       </w:pPr>
       <w:r>
-        <w:rPr>
-          <w:noProof/>
-          <w:sz w:val="44"/>
-          <w:szCs w:val="40"/>
-        </w:rPr>
         <mc:AlternateContent>
           <mc:Choice Requires="wps">
             <w:drawing>
@@ -11924,10 +12101,6 @@
         </mc:AlternateContent>
       </w:r>
       <w:r>
-        <w:rPr>
-          <w:sz w:val="44"/>
-          <w:szCs w:val="40"/>
-        </w:rPr>
         <w:t>7. Puntos de Función</w:t>
       </w:r>
       <w:bookmarkEnd w:id="24"/>
@@ -11947,7 +12120,7 @@
       <w:pPr>
         <w:pStyle w:val="Heading2"/>
       </w:pPr>
-      <w:bookmarkStart w:id="25" w:name="_Toc230112857"/>
+      <w:bookmarkStart w:id="25" w:name="_Toc230301206"/>
       <w:r>
         <w:rPr>
           <w:noProof/>
@@ -12143,7 +12316,7 @@
       <w:pPr>
         <w:pStyle w:val="Heading2"/>
       </w:pPr>
-      <w:bookmarkStart w:id="26" w:name="_Toc230112858"/>
+      <w:bookmarkStart w:id="26" w:name="_Toc230301207"/>
       <w:r>
         <w:rPr>
           <w:noProof/>
@@ -12328,7 +12501,7 @@
       <w:pPr>
         <w:pStyle w:val="Heading2"/>
       </w:pPr>
-      <w:bookmarkStart w:id="27" w:name="_Toc230112859"/>
+      <w:bookmarkStart w:id="27" w:name="_Toc230301208"/>
       <w:r>
         <w:rPr>
           <w:noProof/>
@@ -12519,7 +12692,7 @@
       <w:pPr>
         <w:pStyle w:val="Heading2"/>
       </w:pPr>
-      <w:bookmarkStart w:id="28" w:name="_Toc230112860"/>
+      <w:bookmarkStart w:id="28" w:name="_Toc230301209"/>
       <w:r>
         <w:rPr>
           <w:noProof/>
@@ -12708,7 +12881,7 @@
         </w:rPr>
       </w:pPr>
     </w:p>
-    <w:bookmarkStart w:id="29" w:name="_Toc230112861"/>
+    <w:bookmarkStart w:id="29" w:name="_Toc230301210"/>
     <w:p>
       <w:pPr>
         <w:pStyle w:val="Heading2"/>
@@ -13908,7 +14081,7 @@
         </w:rPr>
       </w:pPr>
     </w:p>
-    <w:bookmarkStart w:id="30" w:name="_Toc230112862"/>
+    <w:bookmarkStart w:id="30" w:name="_Toc230301211"/>
     <w:p>
       <w:pPr>
         <w:pStyle w:val="Heading2"/>
@@ -14421,10 +14594,27 @@
       </w:r>
     </w:p>
     <w:p>
-      <w:r>
+      <w:pPr>
+        <w:rPr>
+          <w:rFonts w:ascii="Baskerville" w:hAnsi="Baskerville"/>
+          <w:sz w:val="24"/>
+          <w:szCs w:val="24"/>
+        </w:rPr>
+      </w:pPr>
+      <w:r>
+        <w:rPr>
+          <w:rFonts w:ascii="Baskerville" w:hAnsi="Baskerville"/>
+          <w:sz w:val="24"/>
+          <w:szCs w:val="24"/>
+        </w:rPr>
         <w:t>Se detecto una variedad de gastos operativos dentro d</w:t>
       </w:r>
       <w:r>
+        <w:rPr>
+          <w:rFonts w:ascii="Baskerville" w:hAnsi="Baskerville"/>
+          <w:sz w:val="24"/>
+          <w:szCs w:val="24"/>
+        </w:rPr>
         <w:t>el proyecto, consistentes en lo siguiente:</w:t>
       </w:r>
     </w:p>
@@ -16703,6 +16893,1195 @@
         <w:jc w:val="both"/>
         <w:rPr>
           <w:rFonts w:ascii="Baskerville" w:hAnsi="Baskerville"/>
+        </w:rPr>
+      </w:pPr>
+    </w:p>
+    <w:p>
+      <w:pPr>
+        <w:spacing w:line="276" w:lineRule="auto"/>
+        <w:jc w:val="both"/>
+        <w:rPr>
+          <w:rFonts w:ascii="Baskerville" w:hAnsi="Baskerville"/>
+        </w:rPr>
+      </w:pPr>
+    </w:p>
+    <w:p>
+      <w:pPr>
+        <w:spacing w:line="276" w:lineRule="auto"/>
+        <w:jc w:val="both"/>
+        <w:rPr>
+          <w:rFonts w:ascii="Baskerville" w:hAnsi="Baskerville"/>
+        </w:rPr>
+      </w:pPr>
+    </w:p>
+    <w:p>
+      <w:pPr>
+        <w:spacing w:line="276" w:lineRule="auto"/>
+        <w:jc w:val="both"/>
+        <w:rPr>
+          <w:rFonts w:ascii="Baskerville" w:hAnsi="Baskerville"/>
+        </w:rPr>
+      </w:pPr>
+    </w:p>
+    <w:p>
+      <w:pPr>
+        <w:spacing w:line="276" w:lineRule="auto"/>
+        <w:jc w:val="both"/>
+        <w:rPr>
+          <w:rFonts w:ascii="Baskerville" w:hAnsi="Baskerville"/>
+        </w:rPr>
+        <w:sectPr>
+          <w:headerReference w:type="default" r:id="rId21"/>
+          <w:footerReference w:type="default" r:id="rId22"/>
+          <w:pgSz w:w="12240" w:h="15840"/>
+          <w:pgMar w:top="1417" w:right="1701" w:bottom="1417" w:left="1701" w:header="708" w:footer="708" w:gutter="0"/>
+          <w:pgNumType w:start="1" w:chapStyle="1"/>
+          <w:cols w:space="708"/>
+          <w:docGrid w:linePitch="360"/>
+        </w:sectPr>
+      </w:pPr>
+    </w:p>
+    <w:p>
+      <w:pPr>
+        <w:spacing w:line="276" w:lineRule="auto"/>
+        <w:jc w:val="both"/>
+        <w:rPr>
+          <w:rFonts w:ascii="Baskerville" w:hAnsi="Baskerville"/>
+        </w:rPr>
+      </w:pPr>
+      <w:r>
+        <w:rPr>
+          <w:noProof/>
+          <w:sz w:val="36"/>
+          <w:szCs w:val="32"/>
+        </w:rPr>
+        <w:lastRenderedPageBreak/>
+        <mc:AlternateContent>
+          <mc:Choice Requires="wps">
+            <w:drawing>
+              <wp:anchor distT="0" distB="0" distL="114300" distR="114300" simplePos="0" relativeHeight="251663424" behindDoc="0" locked="0" layoutInCell="1" allowOverlap="1" wp14:anchorId="375BC169" wp14:editId="5617A0DA">
+                <wp:simplePos x="0" y="0"/>
+                <wp:positionH relativeFrom="column">
+                  <wp:posOffset>-1094740</wp:posOffset>
+                </wp:positionH>
+                <wp:positionV relativeFrom="paragraph">
+                  <wp:posOffset>157480</wp:posOffset>
+                </wp:positionV>
+                <wp:extent cx="7745656" cy="128239"/>
+                <wp:effectExtent l="0" t="0" r="0" b="0"/>
+                <wp:wrapNone/>
+                <wp:docPr id="631806901" name="Equal 21"/>
+                <wp:cNvGraphicFramePr/>
+                <a:graphic xmlns:a="http://schemas.openxmlformats.org/drawingml/2006/main">
+                  <a:graphicData uri="http://schemas.microsoft.com/office/word/2010/wordprocessingShape">
+                    <wps:wsp>
+                      <wps:cNvSpPr/>
+                      <wps:spPr>
+                        <a:xfrm>
+                          <a:off x="0" y="0"/>
+                          <a:ext cx="7745656" cy="128239"/>
+                        </a:xfrm>
+                        <a:prstGeom prst="mathEqual">
+                          <a:avLst>
+                            <a:gd name="adj1" fmla="val 23520"/>
+                            <a:gd name="adj2" fmla="val 18918"/>
+                          </a:avLst>
+                        </a:prstGeom>
+                        <a:solidFill>
+                          <a:schemeClr val="bg1">
+                            <a:lumMod val="85000"/>
+                          </a:schemeClr>
+                        </a:solidFill>
+                        <a:ln>
+                          <a:noFill/>
+                        </a:ln>
+                      </wps:spPr>
+                      <wps:style>
+                        <a:lnRef idx="2">
+                          <a:schemeClr val="dk1">
+                            <a:shade val="15000"/>
+                          </a:schemeClr>
+                        </a:lnRef>
+                        <a:fillRef idx="1">
+                          <a:schemeClr val="dk1"/>
+                        </a:fillRef>
+                        <a:effectRef idx="0">
+                          <a:schemeClr val="dk1"/>
+                        </a:effectRef>
+                        <a:fontRef idx="minor">
+                          <a:schemeClr val="lt1"/>
+                        </a:fontRef>
+                      </wps:style>
+                      <wps:bodyPr rot="0" spcFirstLastPara="0" vertOverflow="overflow" horzOverflow="overflow" vert="horz" wrap="square" lIns="91440" tIns="45720" rIns="91440" bIns="45720" numCol="1" spcCol="0" rtlCol="0" fromWordArt="0" anchor="ctr" anchorCtr="0" forceAA="0" compatLnSpc="1">
+                        <a:prstTxWarp prst="textNoShape">
+                          <a:avLst/>
+                        </a:prstTxWarp>
+                        <a:noAutofit/>
+                      </wps:bodyPr>
+                    </wps:wsp>
+                  </a:graphicData>
+                </a:graphic>
+                <wp14:sizeRelH relativeFrom="margin">
+                  <wp14:pctWidth>0</wp14:pctWidth>
+                </wp14:sizeRelH>
+                <wp14:sizeRelV relativeFrom="margin">
+                  <wp14:pctHeight>0</wp14:pctHeight>
+                </wp14:sizeRelV>
+              </wp:anchor>
+            </w:drawing>
+          </mc:Choice>
+          <mc:Fallback>
+            <w:pict>
+              <v:shape w14:anchorId="295A9F72" id="Equal 21" o:spid="_x0000_s1026" style="position:absolute;margin-left:-86.2pt;margin-top:12.4pt;width:609.9pt;height:10.1pt;z-index:251663424;visibility:visible;mso-wrap-style:square;mso-width-percent:0;mso-height-percent:0;mso-wrap-distance-left:9pt;mso-wrap-distance-top:0;mso-wrap-distance-right:9pt;mso-wrap-distance-bottom:0;mso-position-horizontal:absolute;mso-position-horizontal-relative:text;mso-position-vertical:absolute;mso-position-vertical-relative:text;mso-width-percent:0;mso-height-percent:0;mso-width-relative:margin;mso-height-relative:margin;v-text-anchor:middle" coordsize="7745656,128239" o:gfxdata="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" path="m1026687,21828r5692282,l6718969,51989r-5692282,l1026687,21828xm1026687,76250r5692282,l6718969,106411r-5692282,l1026687,76250xe" fillcolor="#d8d8d8 [2732]" stroked="f" strokeweight="1pt">
+                <v:stroke joinstyle="miter"/>
+                <v:path arrowok="t" o:connecttype="custom" o:connectlocs="1026687,21828;6718969,21828;6718969,51989;1026687,51989;1026687,21828;1026687,76250;6718969,76250;6718969,106411;1026687,106411;1026687,76250" o:connectangles="0,0,0,0,0,0,0,0,0,0"/>
+              </v:shape>
+            </w:pict>
+          </mc:Fallback>
+        </mc:AlternateContent>
+      </w:r>
+    </w:p>
+    <w:p>
+      <w:pPr>
+        <w:pStyle w:val="Heading1"/>
+        <w:rPr>
+          <w:rStyle w:val="TitleChar"/>
+          <w:sz w:val="44"/>
+          <w:szCs w:val="40"/>
+        </w:rPr>
+      </w:pPr>
+      <w:bookmarkStart w:id="31" w:name="_Toc230301212"/>
+      <w:r>
+        <mc:AlternateContent>
+          <mc:Choice Requires="wps">
+            <w:drawing>
+              <wp:anchor distT="0" distB="0" distL="114300" distR="114300" simplePos="0" relativeHeight="251662400" behindDoc="0" locked="0" layoutInCell="1" allowOverlap="1" wp14:anchorId="63829E84" wp14:editId="201D10AC">
+                <wp:simplePos x="0" y="0"/>
+                <wp:positionH relativeFrom="column">
+                  <wp:posOffset>-1090930</wp:posOffset>
+                </wp:positionH>
+                <wp:positionV relativeFrom="paragraph">
+                  <wp:posOffset>302260</wp:posOffset>
+                </wp:positionV>
+                <wp:extent cx="7745656" cy="128239"/>
+                <wp:effectExtent l="0" t="0" r="0" b="0"/>
+                <wp:wrapNone/>
+                <wp:docPr id="461013544" name="Equal 21"/>
+                <wp:cNvGraphicFramePr/>
+                <a:graphic xmlns:a="http://schemas.openxmlformats.org/drawingml/2006/main">
+                  <a:graphicData uri="http://schemas.microsoft.com/office/word/2010/wordprocessingShape">
+                    <wps:wsp>
+                      <wps:cNvSpPr/>
+                      <wps:spPr>
+                        <a:xfrm>
+                          <a:off x="0" y="0"/>
+                          <a:ext cx="7745656" cy="128239"/>
+                        </a:xfrm>
+                        <a:prstGeom prst="mathEqual">
+                          <a:avLst>
+                            <a:gd name="adj1" fmla="val 23520"/>
+                            <a:gd name="adj2" fmla="val 18918"/>
+                          </a:avLst>
+                        </a:prstGeom>
+                        <a:solidFill>
+                          <a:schemeClr val="bg1">
+                            <a:lumMod val="85000"/>
+                          </a:schemeClr>
+                        </a:solidFill>
+                        <a:ln>
+                          <a:noFill/>
+                        </a:ln>
+                      </wps:spPr>
+                      <wps:style>
+                        <a:lnRef idx="2">
+                          <a:schemeClr val="dk1">
+                            <a:shade val="15000"/>
+                          </a:schemeClr>
+                        </a:lnRef>
+                        <a:fillRef idx="1">
+                          <a:schemeClr val="dk1"/>
+                        </a:fillRef>
+                        <a:effectRef idx="0">
+                          <a:schemeClr val="dk1"/>
+                        </a:effectRef>
+                        <a:fontRef idx="minor">
+                          <a:schemeClr val="lt1"/>
+                        </a:fontRef>
+                      </wps:style>
+                      <wps:bodyPr rot="0" spcFirstLastPara="0" vertOverflow="overflow" horzOverflow="overflow" vert="horz" wrap="square" lIns="91440" tIns="45720" rIns="91440" bIns="45720" numCol="1" spcCol="0" rtlCol="0" fromWordArt="0" anchor="ctr" anchorCtr="0" forceAA="0" compatLnSpc="1">
+                        <a:prstTxWarp prst="textNoShape">
+                          <a:avLst/>
+                        </a:prstTxWarp>
+                        <a:noAutofit/>
+                      </wps:bodyPr>
+                    </wps:wsp>
+                  </a:graphicData>
+                </a:graphic>
+                <wp14:sizeRelH relativeFrom="margin">
+                  <wp14:pctWidth>0</wp14:pctWidth>
+                </wp14:sizeRelH>
+                <wp14:sizeRelV relativeFrom="margin">
+                  <wp14:pctHeight>0</wp14:pctHeight>
+                </wp14:sizeRelV>
+              </wp:anchor>
+            </w:drawing>
+          </mc:Choice>
+          <mc:Fallback>
+            <w:pict>
+              <v:shape w14:anchorId="36299A59" id="Equal 21" o:spid="_x0000_s1026" style="position:absolute;margin-left:-85.9pt;margin-top:23.8pt;width:609.9pt;height:10.1pt;z-index:251662400;visibility:visible;mso-wrap-style:square;mso-width-percent:0;mso-height-percent:0;mso-wrap-distance-left:9pt;mso-wrap-distance-top:0;mso-wrap-distance-right:9pt;mso-wrap-distance-bottom:0;mso-position-horizontal:absolute;mso-position-horizontal-relative:text;mso-position-vertical:absolute;mso-position-vertical-relative:text;mso-width-percent:0;mso-height-percent:0;mso-width-relative:margin;mso-height-relative:margin;v-text-anchor:middle" coordsize="7745656,128239" o:gfxdata="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" path="m1026687,21828r5692282,l6718969,51989r-5692282,l1026687,21828xm1026687,76250r5692282,l6718969,106411r-5692282,l1026687,76250xe" fillcolor="#d8d8d8 [2732]" stroked="f" strokeweight="1pt">
+                <v:stroke joinstyle="miter"/>
+                <v:path arrowok="t" o:connecttype="custom" o:connectlocs="1026687,21828;6718969,21828;6718969,51989;1026687,51989;1026687,21828;1026687,76250;6718969,76250;6718969,106411;1026687,106411;1026687,76250" o:connectangles="0,0,0,0,0,0,0,0,0,0"/>
+              </v:shape>
+            </w:pict>
+          </mc:Fallback>
+        </mc:AlternateContent>
+      </w:r>
+      <w:r>
+        <w:t>8</w:t>
+      </w:r>
+      <w:r>
+        <w:t xml:space="preserve">. </w:t>
+      </w:r>
+      <w:r>
+        <w:t>Plan del Proyecto</w:t>
+      </w:r>
+      <w:bookmarkEnd w:id="31"/>
+    </w:p>
+    <w:p>
+      <w:pPr>
+        <w:spacing w:line="276" w:lineRule="auto"/>
+        <w:jc w:val="both"/>
+        <w:rPr>
+          <w:rFonts w:ascii="Baskerville" w:hAnsi="Baskerville"/>
+        </w:rPr>
+      </w:pPr>
+    </w:p>
+    <w:p>
+      <w:pPr>
+        <w:pStyle w:val="Heading2"/>
+      </w:pPr>
+      <w:bookmarkStart w:id="32" w:name="_Toc230301213"/>
+      <w:r>
+        <w:rPr>
+          <w:noProof/>
+        </w:rPr>
+        <w:drawing>
+          <wp:anchor distT="0" distB="0" distL="114300" distR="114300" simplePos="0" relativeHeight="251670592" behindDoc="0" locked="0" layoutInCell="1" allowOverlap="1" wp14:anchorId="54AA58D5" wp14:editId="48AE0732">
+            <wp:simplePos x="0" y="0"/>
+            <wp:positionH relativeFrom="column">
+              <wp:posOffset>-14086</wp:posOffset>
+            </wp:positionH>
+            <wp:positionV relativeFrom="paragraph">
+              <wp:posOffset>362585</wp:posOffset>
+            </wp:positionV>
+            <wp:extent cx="7550727" cy="4303110"/>
+            <wp:effectExtent l="0" t="0" r="0" b="2540"/>
+            <wp:wrapTopAndBottom/>
+            <wp:docPr id="1410462532" name="Picture 70"/>
+            <wp:cNvGraphicFramePr>
+              <a:graphicFrameLocks xmlns:a="http://schemas.openxmlformats.org/drawingml/2006/main" noChangeAspect="1"/>
+            </wp:cNvGraphicFramePr>
+            <a:graphic xmlns:a="http://schemas.openxmlformats.org/drawingml/2006/main">
+              <a:graphicData uri="http://schemas.openxmlformats.org/drawingml/2006/picture">
+                <pic:pic xmlns:pic="http://schemas.openxmlformats.org/drawingml/2006/picture">
+                  <pic:nvPicPr>
+                    <pic:cNvPr id="1410462532" name="Picture 1410462532"/>
+                    <pic:cNvPicPr/>
+                  </pic:nvPicPr>
+                  <pic:blipFill>
+                    <a:blip r:embed="rId23" cstate="print">
+                      <a:extLst>
+                        <a:ext uri="{28A0092B-C50C-407E-A947-70E740481C1C}">
+                          <a14:useLocalDpi xmlns:a14="http://schemas.microsoft.com/office/drawing/2010/main" val="0"/>
+                        </a:ext>
+                      </a:extLst>
+                    </a:blip>
+                    <a:stretch>
+                      <a:fillRect/>
+                    </a:stretch>
+                  </pic:blipFill>
+                  <pic:spPr>
+                    <a:xfrm>
+                      <a:off x="0" y="0"/>
+                      <a:ext cx="7550727" cy="4303110"/>
+                    </a:xfrm>
+                    <a:prstGeom prst="rect">
+                      <a:avLst/>
+                    </a:prstGeom>
+                  </pic:spPr>
+                </pic:pic>
+              </a:graphicData>
+            </a:graphic>
+            <wp14:sizeRelH relativeFrom="page">
+              <wp14:pctWidth>0</wp14:pctWidth>
+            </wp14:sizeRelH>
+            <wp14:sizeRelV relativeFrom="page">
+              <wp14:pctHeight>0</wp14:pctHeight>
+            </wp14:sizeRelV>
+          </wp:anchor>
+        </w:drawing>
+      </w:r>
+      <w:r>
+        <w:rPr>
+          <w:noProof/>
+          <w:sz w:val="36"/>
+          <w:szCs w:val="32"/>
+        </w:rPr>
+        <mc:AlternateContent>
+          <mc:Choice Requires="wps">
+            <w:drawing>
+              <wp:anchor distT="0" distB="0" distL="114300" distR="114300" simplePos="0" relativeHeight="251665472" behindDoc="0" locked="0" layoutInCell="1" allowOverlap="1" wp14:anchorId="6CF9A1EA" wp14:editId="2FEE03DA">
+                <wp:simplePos x="0" y="0"/>
+                <wp:positionH relativeFrom="column">
+                  <wp:posOffset>-840510</wp:posOffset>
+                </wp:positionH>
+                <wp:positionV relativeFrom="paragraph">
+                  <wp:posOffset>211802</wp:posOffset>
+                </wp:positionV>
+                <wp:extent cx="6257925" cy="127635"/>
+                <wp:effectExtent l="0" t="0" r="0" b="0"/>
+                <wp:wrapNone/>
+                <wp:docPr id="1588688560" name="Equal 21"/>
+                <wp:cNvGraphicFramePr/>
+                <a:graphic xmlns:a="http://schemas.openxmlformats.org/drawingml/2006/main">
+                  <a:graphicData uri="http://schemas.microsoft.com/office/word/2010/wordprocessingShape">
+                    <wps:wsp>
+                      <wps:cNvSpPr/>
+                      <wps:spPr>
+                        <a:xfrm>
+                          <a:off x="0" y="0"/>
+                          <a:ext cx="6257925" cy="127635"/>
+                        </a:xfrm>
+                        <a:prstGeom prst="mathEqual">
+                          <a:avLst>
+                            <a:gd name="adj1" fmla="val 7284"/>
+                            <a:gd name="adj2" fmla="val 18918"/>
+                          </a:avLst>
+                        </a:prstGeom>
+                        <a:solidFill>
+                          <a:schemeClr val="bg1">
+                            <a:lumMod val="85000"/>
+                          </a:schemeClr>
+                        </a:solidFill>
+                        <a:ln>
+                          <a:noFill/>
+                        </a:ln>
+                      </wps:spPr>
+                      <wps:style>
+                        <a:lnRef idx="2">
+                          <a:schemeClr val="dk1">
+                            <a:shade val="15000"/>
+                          </a:schemeClr>
+                        </a:lnRef>
+                        <a:fillRef idx="1">
+                          <a:schemeClr val="dk1"/>
+                        </a:fillRef>
+                        <a:effectRef idx="0">
+                          <a:schemeClr val="dk1"/>
+                        </a:effectRef>
+                        <a:fontRef idx="minor">
+                          <a:schemeClr val="lt1"/>
+                        </a:fontRef>
+                      </wps:style>
+                      <wps:bodyPr rot="0" spcFirstLastPara="0" vertOverflow="overflow" horzOverflow="overflow" vert="horz" wrap="square" lIns="91440" tIns="45720" rIns="91440" bIns="45720" numCol="1" spcCol="0" rtlCol="0" fromWordArt="0" anchor="ctr" anchorCtr="0" forceAA="0" compatLnSpc="1">
+                        <a:prstTxWarp prst="textNoShape">
+                          <a:avLst/>
+                        </a:prstTxWarp>
+                        <a:noAutofit/>
+                      </wps:bodyPr>
+                    </wps:wsp>
+                  </a:graphicData>
+                </a:graphic>
+                <wp14:sizeRelH relativeFrom="margin">
+                  <wp14:pctWidth>0</wp14:pctWidth>
+                </wp14:sizeRelH>
+                <wp14:sizeRelV relativeFrom="margin">
+                  <wp14:pctHeight>0</wp14:pctHeight>
+                </wp14:sizeRelV>
+              </wp:anchor>
+            </w:drawing>
+          </mc:Choice>
+          <mc:Fallback>
+            <w:pict>
+              <v:shape w14:anchorId="5F4BDC88" id="Equal 21" o:spid="_x0000_s1026" style="position:absolute;margin-left:-66.2pt;margin-top:16.7pt;width:492.75pt;height:10.05pt;z-index:251665472;visibility:visible;mso-wrap-style:square;mso-width-percent:0;mso-height-percent:0;mso-wrap-distance-left:9pt;mso-wrap-distance-top:0;mso-wrap-distance-right:9pt;mso-wrap-distance-bottom:0;mso-position-horizontal:absolute;mso-position-horizontal-relative:text;mso-position-vertical:absolute;mso-position-vertical-relative:text;mso-width-percent:0;mso-height-percent:0;mso-width-relative:margin;mso-height-relative:margin;v-text-anchor:middle" coordsize="6257925,127635" o:gfxdata="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" path="m829488,42448r4598949,l5428437,51745r-4598949,l829488,42448xm829488,75890r4598949,l5428437,85187r-4598949,l829488,75890xe" fillcolor="#d8d8d8 [2732]" stroked="f" strokeweight="1pt">
+                <v:stroke joinstyle="miter"/>
+                <v:path arrowok="t" o:connecttype="custom" o:connectlocs="829488,42448;5428437,42448;5428437,51745;829488,51745;829488,42448;829488,75890;5428437,75890;5428437,85187;829488,85187;829488,75890" o:connectangles="0,0,0,0,0,0,0,0,0,0"/>
+              </v:shape>
+            </w:pict>
+          </mc:Fallback>
+        </mc:AlternateContent>
+      </w:r>
+      <w:r>
+        <w:t>8</w:t>
+      </w:r>
+      <w:r>
+        <w:t>.</w:t>
+      </w:r>
+      <w:r>
+        <w:t>1</w:t>
+      </w:r>
+      <w:r>
+        <w:t xml:space="preserve"> </w:t>
+      </w:r>
+      <w:r>
+        <w:t>EDT (Estructura de Desglose del Trabajo)</w:t>
+      </w:r>
+      <w:bookmarkEnd w:id="32"/>
+    </w:p>
+    <w:p>
+      <w:pPr>
+        <w:spacing w:line="276" w:lineRule="auto"/>
+        <w:jc w:val="both"/>
+        <w:rPr>
+          <w:rFonts w:ascii="Baskerville" w:hAnsi="Baskerville"/>
+        </w:rPr>
+      </w:pPr>
+    </w:p>
+    <w:p>
+      <w:pPr>
+        <w:pStyle w:val="Heading2"/>
+      </w:pPr>
+      <w:bookmarkStart w:id="33" w:name="_Toc230301214"/>
+      <w:r>
+        <w:rPr>
+          <w:noProof/>
+          <w:sz w:val="24"/>
+          <w:szCs w:val="24"/>
+        </w:rPr>
+        <w:drawing>
+          <wp:anchor distT="0" distB="0" distL="114300" distR="114300" simplePos="0" relativeHeight="251671616" behindDoc="0" locked="0" layoutInCell="1" allowOverlap="1" wp14:anchorId="730F7CB0" wp14:editId="5B3E59C4">
+            <wp:simplePos x="0" y="0"/>
+            <wp:positionH relativeFrom="column">
+              <wp:posOffset>464185</wp:posOffset>
+            </wp:positionH>
+            <wp:positionV relativeFrom="paragraph">
+              <wp:posOffset>383540</wp:posOffset>
+            </wp:positionV>
+            <wp:extent cx="7275600" cy="4937901"/>
+            <wp:effectExtent l="0" t="0" r="1905" b="2540"/>
+            <wp:wrapTopAndBottom/>
+            <wp:docPr id="1192117471" name="Picture 71"/>
+            <wp:cNvGraphicFramePr>
+              <a:graphicFrameLocks xmlns:a="http://schemas.openxmlformats.org/drawingml/2006/main" noChangeAspect="1"/>
+            </wp:cNvGraphicFramePr>
+            <a:graphic xmlns:a="http://schemas.openxmlformats.org/drawingml/2006/main">
+              <a:graphicData uri="http://schemas.openxmlformats.org/drawingml/2006/picture">
+                <pic:pic xmlns:pic="http://schemas.openxmlformats.org/drawingml/2006/picture">
+                  <pic:nvPicPr>
+                    <pic:cNvPr id="1192117471" name="Picture 1192117471"/>
+                    <pic:cNvPicPr/>
+                  </pic:nvPicPr>
+                  <pic:blipFill>
+                    <a:blip r:embed="rId24" cstate="print">
+                      <a:extLst>
+                        <a:ext uri="{28A0092B-C50C-407E-A947-70E740481C1C}">
+                          <a14:useLocalDpi xmlns:a14="http://schemas.microsoft.com/office/drawing/2010/main" val="0"/>
+                        </a:ext>
+                      </a:extLst>
+                    </a:blip>
+                    <a:stretch>
+                      <a:fillRect/>
+                    </a:stretch>
+                  </pic:blipFill>
+                  <pic:spPr>
+                    <a:xfrm>
+                      <a:off x="0" y="0"/>
+                      <a:ext cx="7275600" cy="4937901"/>
+                    </a:xfrm>
+                    <a:prstGeom prst="rect">
+                      <a:avLst/>
+                    </a:prstGeom>
+                  </pic:spPr>
+                </pic:pic>
+              </a:graphicData>
+            </a:graphic>
+            <wp14:sizeRelH relativeFrom="page">
+              <wp14:pctWidth>0</wp14:pctWidth>
+            </wp14:sizeRelH>
+            <wp14:sizeRelV relativeFrom="page">
+              <wp14:pctHeight>0</wp14:pctHeight>
+            </wp14:sizeRelV>
+          </wp:anchor>
+        </w:drawing>
+      </w:r>
+      <w:r>
+        <w:rPr>
+          <w:noProof/>
+          <w:sz w:val="36"/>
+          <w:szCs w:val="32"/>
+        </w:rPr>
+        <mc:AlternateContent>
+          <mc:Choice Requires="wps">
+            <w:drawing>
+              <wp:anchor distT="0" distB="0" distL="114300" distR="114300" simplePos="0" relativeHeight="251667520" behindDoc="0" locked="0" layoutInCell="1" allowOverlap="1" wp14:anchorId="018FCAA9" wp14:editId="045E7024">
+                <wp:simplePos x="0" y="0"/>
+                <wp:positionH relativeFrom="column">
+                  <wp:posOffset>-840510</wp:posOffset>
+                </wp:positionH>
+                <wp:positionV relativeFrom="paragraph">
+                  <wp:posOffset>211802</wp:posOffset>
+                </wp:positionV>
+                <wp:extent cx="6257925" cy="127635"/>
+                <wp:effectExtent l="0" t="0" r="0" b="0"/>
+                <wp:wrapNone/>
+                <wp:docPr id="26687088" name="Equal 21"/>
+                <wp:cNvGraphicFramePr/>
+                <a:graphic xmlns:a="http://schemas.openxmlformats.org/drawingml/2006/main">
+                  <a:graphicData uri="http://schemas.microsoft.com/office/word/2010/wordprocessingShape">
+                    <wps:wsp>
+                      <wps:cNvSpPr/>
+                      <wps:spPr>
+                        <a:xfrm>
+                          <a:off x="0" y="0"/>
+                          <a:ext cx="6257925" cy="127635"/>
+                        </a:xfrm>
+                        <a:prstGeom prst="mathEqual">
+                          <a:avLst>
+                            <a:gd name="adj1" fmla="val 7284"/>
+                            <a:gd name="adj2" fmla="val 18918"/>
+                          </a:avLst>
+                        </a:prstGeom>
+                        <a:solidFill>
+                          <a:schemeClr val="bg1">
+                            <a:lumMod val="85000"/>
+                          </a:schemeClr>
+                        </a:solidFill>
+                        <a:ln>
+                          <a:noFill/>
+                        </a:ln>
+                      </wps:spPr>
+                      <wps:style>
+                        <a:lnRef idx="2">
+                          <a:schemeClr val="dk1">
+                            <a:shade val="15000"/>
+                          </a:schemeClr>
+                        </a:lnRef>
+                        <a:fillRef idx="1">
+                          <a:schemeClr val="dk1"/>
+                        </a:fillRef>
+                        <a:effectRef idx="0">
+                          <a:schemeClr val="dk1"/>
+                        </a:effectRef>
+                        <a:fontRef idx="minor">
+                          <a:schemeClr val="lt1"/>
+                        </a:fontRef>
+                      </wps:style>
+                      <wps:bodyPr rot="0" spcFirstLastPara="0" vertOverflow="overflow" horzOverflow="overflow" vert="horz" wrap="square" lIns="91440" tIns="45720" rIns="91440" bIns="45720" numCol="1" spcCol="0" rtlCol="0" fromWordArt="0" anchor="ctr" anchorCtr="0" forceAA="0" compatLnSpc="1">
+                        <a:prstTxWarp prst="textNoShape">
+                          <a:avLst/>
+                        </a:prstTxWarp>
+                        <a:noAutofit/>
+                      </wps:bodyPr>
+                    </wps:wsp>
+                  </a:graphicData>
+                </a:graphic>
+                <wp14:sizeRelH relativeFrom="margin">
+                  <wp14:pctWidth>0</wp14:pctWidth>
+                </wp14:sizeRelH>
+                <wp14:sizeRelV relativeFrom="margin">
+                  <wp14:pctHeight>0</wp14:pctHeight>
+                </wp14:sizeRelV>
+              </wp:anchor>
+            </w:drawing>
+          </mc:Choice>
+          <mc:Fallback>
+            <w:pict>
+              <v:shape w14:anchorId="7D47B0BE" id="Equal 21" o:spid="_x0000_s1026" style="position:absolute;margin-left:-66.2pt;margin-top:16.7pt;width:492.75pt;height:10.05pt;z-index:251667520;visibility:visible;mso-wrap-style:square;mso-width-percent:0;mso-height-percent:0;mso-wrap-distance-left:9pt;mso-wrap-distance-top:0;mso-wrap-distance-right:9pt;mso-wrap-distance-bottom:0;mso-position-horizontal:absolute;mso-position-horizontal-relative:text;mso-position-vertical:absolute;mso-position-vertical-relative:text;mso-width-percent:0;mso-height-percent:0;mso-width-relative:margin;mso-height-relative:margin;v-text-anchor:middle" coordsize="6257925,127635" o:gfxdata="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" path="m829488,42448r4598949,l5428437,51745r-4598949,l829488,42448xm829488,75890r4598949,l5428437,85187r-4598949,l829488,75890xe" fillcolor="#d8d8d8 [2732]" stroked="f" strokeweight="1pt">
+                <v:stroke joinstyle="miter"/>
+                <v:path arrowok="t" o:connecttype="custom" o:connectlocs="829488,42448;5428437,42448;5428437,51745;829488,51745;829488,42448;829488,75890;5428437,75890;5428437,85187;829488,85187;829488,75890" o:connectangles="0,0,0,0,0,0,0,0,0,0"/>
+              </v:shape>
+            </w:pict>
+          </mc:Fallback>
+        </mc:AlternateContent>
+      </w:r>
+      <w:r>
+        <w:t>8.</w:t>
+      </w:r>
+      <w:r>
+        <w:t>2</w:t>
+      </w:r>
+      <w:r>
+        <w:t xml:space="preserve"> </w:t>
+      </w:r>
+      <w:r>
+        <w:t>Cronograma</w:t>
+      </w:r>
+      <w:bookmarkEnd w:id="33"/>
+    </w:p>
+    <w:p>
+      <w:pPr>
+        <w:spacing w:line="276" w:lineRule="auto"/>
+        <w:jc w:val="both"/>
+        <w:rPr>
+          <w:rFonts w:ascii="Baskerville" w:hAnsi="Baskerville"/>
+          <w:sz w:val="24"/>
+          <w:szCs w:val="24"/>
+        </w:rPr>
+      </w:pPr>
+      <w:r>
+        <w:rPr>
+          <w:rFonts w:ascii="Baskerville" w:hAnsi="Baskerville"/>
+          <w:noProof/>
+          <w:sz w:val="24"/>
+          <w:szCs w:val="24"/>
+        </w:rPr>
+        <w:lastRenderedPageBreak/>
+        <w:drawing>
+          <wp:anchor distT="0" distB="0" distL="114300" distR="114300" simplePos="0" relativeHeight="251672640" behindDoc="0" locked="0" layoutInCell="1" allowOverlap="1" wp14:anchorId="15519383" wp14:editId="5C4DE88C">
+            <wp:simplePos x="0" y="0"/>
+            <wp:positionH relativeFrom="column">
+              <wp:posOffset>520504</wp:posOffset>
+            </wp:positionH>
+            <wp:positionV relativeFrom="paragraph">
+              <wp:posOffset>196</wp:posOffset>
+            </wp:positionV>
+            <wp:extent cx="7275600" cy="2913373"/>
+            <wp:effectExtent l="0" t="0" r="1905" b="0"/>
+            <wp:wrapTopAndBottom/>
+            <wp:docPr id="2005485208" name="Picture 72"/>
+            <wp:cNvGraphicFramePr>
+              <a:graphicFrameLocks xmlns:a="http://schemas.openxmlformats.org/drawingml/2006/main" noChangeAspect="1"/>
+            </wp:cNvGraphicFramePr>
+            <a:graphic xmlns:a="http://schemas.openxmlformats.org/drawingml/2006/main">
+              <a:graphicData uri="http://schemas.openxmlformats.org/drawingml/2006/picture">
+                <pic:pic xmlns:pic="http://schemas.openxmlformats.org/drawingml/2006/picture">
+                  <pic:nvPicPr>
+                    <pic:cNvPr id="2005485208" name="Picture 2005485208"/>
+                    <pic:cNvPicPr/>
+                  </pic:nvPicPr>
+                  <pic:blipFill>
+                    <a:blip r:embed="rId25" cstate="print">
+                      <a:extLst>
+                        <a:ext uri="{28A0092B-C50C-407E-A947-70E740481C1C}">
+                          <a14:useLocalDpi xmlns:a14="http://schemas.microsoft.com/office/drawing/2010/main" val="0"/>
+                        </a:ext>
+                      </a:extLst>
+                    </a:blip>
+                    <a:stretch>
+                      <a:fillRect/>
+                    </a:stretch>
+                  </pic:blipFill>
+                  <pic:spPr>
+                    <a:xfrm>
+                      <a:off x="0" y="0"/>
+                      <a:ext cx="7275600" cy="2913373"/>
+                    </a:xfrm>
+                    <a:prstGeom prst="rect">
+                      <a:avLst/>
+                    </a:prstGeom>
+                  </pic:spPr>
+                </pic:pic>
+              </a:graphicData>
+            </a:graphic>
+            <wp14:sizeRelH relativeFrom="page">
+              <wp14:pctWidth>0</wp14:pctWidth>
+            </wp14:sizeRelH>
+            <wp14:sizeRelV relativeFrom="page">
+              <wp14:pctHeight>0</wp14:pctHeight>
+            </wp14:sizeRelV>
+          </wp:anchor>
+        </w:drawing>
+      </w:r>
+    </w:p>
+    <w:p>
+      <w:pPr>
+        <w:spacing w:line="276" w:lineRule="auto"/>
+        <w:jc w:val="both"/>
+        <w:rPr>
+          <w:rFonts w:ascii="Baskerville" w:hAnsi="Baskerville"/>
+        </w:rPr>
+      </w:pPr>
+    </w:p>
+    <w:p>
+      <w:pPr>
+        <w:spacing w:line="276" w:lineRule="auto"/>
+        <w:jc w:val="both"/>
+        <w:rPr>
+          <w:rFonts w:ascii="Baskerville" w:hAnsi="Baskerville"/>
+        </w:rPr>
+        <w:sectPr>
+          <w:headerReference w:type="default" r:id="rId26"/>
+          <w:pgSz w:w="15840" w:h="12240" w:orient="landscape"/>
+          <w:pgMar w:top="1701" w:right="1417" w:bottom="1701" w:left="1417" w:header="708" w:footer="708" w:gutter="0"/>
+          <w:pgNumType w:chapStyle="1"/>
+          <w:cols w:space="708"/>
+          <w:docGrid w:linePitch="360"/>
+        </w:sectPr>
+      </w:pPr>
+    </w:p>
+    <w:p>
+      <w:pPr>
+        <w:spacing w:line="276" w:lineRule="auto"/>
+        <w:jc w:val="both"/>
+        <w:rPr>
+          <w:rFonts w:ascii="Baskerville" w:hAnsi="Baskerville"/>
+        </w:rPr>
+      </w:pPr>
+    </w:p>
+    <w:p>
+      <w:pPr>
+        <w:pStyle w:val="Heading2"/>
+      </w:pPr>
+      <w:bookmarkStart w:id="34" w:name="_Toc230301215"/>
+      <w:r>
+        <w:rPr>
+          <w:noProof/>
+          <w:sz w:val="36"/>
+          <w:szCs w:val="32"/>
+        </w:rPr>
+        <mc:AlternateContent>
+          <mc:Choice Requires="wps">
+            <w:drawing>
+              <wp:anchor distT="0" distB="0" distL="114300" distR="114300" simplePos="0" relativeHeight="251669568" behindDoc="0" locked="0" layoutInCell="1" allowOverlap="1" wp14:anchorId="63DD5007" wp14:editId="3C54170D">
+                <wp:simplePos x="0" y="0"/>
+                <wp:positionH relativeFrom="column">
+                  <wp:posOffset>-840510</wp:posOffset>
+                </wp:positionH>
+                <wp:positionV relativeFrom="paragraph">
+                  <wp:posOffset>211802</wp:posOffset>
+                </wp:positionV>
+                <wp:extent cx="6257925" cy="127635"/>
+                <wp:effectExtent l="0" t="0" r="0" b="0"/>
+                <wp:wrapNone/>
+                <wp:docPr id="77352895" name="Equal 21"/>
+                <wp:cNvGraphicFramePr/>
+                <a:graphic xmlns:a="http://schemas.openxmlformats.org/drawingml/2006/main">
+                  <a:graphicData uri="http://schemas.microsoft.com/office/word/2010/wordprocessingShape">
+                    <wps:wsp>
+                      <wps:cNvSpPr/>
+                      <wps:spPr>
+                        <a:xfrm>
+                          <a:off x="0" y="0"/>
+                          <a:ext cx="6257925" cy="127635"/>
+                        </a:xfrm>
+                        <a:prstGeom prst="mathEqual">
+                          <a:avLst>
+                            <a:gd name="adj1" fmla="val 7284"/>
+                            <a:gd name="adj2" fmla="val 18918"/>
+                          </a:avLst>
+                        </a:prstGeom>
+                        <a:solidFill>
+                          <a:schemeClr val="bg1">
+                            <a:lumMod val="85000"/>
+                          </a:schemeClr>
+                        </a:solidFill>
+                        <a:ln>
+                          <a:noFill/>
+                        </a:ln>
+                      </wps:spPr>
+                      <wps:style>
+                        <a:lnRef idx="2">
+                          <a:schemeClr val="dk1">
+                            <a:shade val="15000"/>
+                          </a:schemeClr>
+                        </a:lnRef>
+                        <a:fillRef idx="1">
+                          <a:schemeClr val="dk1"/>
+                        </a:fillRef>
+                        <a:effectRef idx="0">
+                          <a:schemeClr val="dk1"/>
+                        </a:effectRef>
+                        <a:fontRef idx="minor">
+                          <a:schemeClr val="lt1"/>
+                        </a:fontRef>
+                      </wps:style>
+                      <wps:bodyPr rot="0" spcFirstLastPara="0" vertOverflow="overflow" horzOverflow="overflow" vert="horz" wrap="square" lIns="91440" tIns="45720" rIns="91440" bIns="45720" numCol="1" spcCol="0" rtlCol="0" fromWordArt="0" anchor="ctr" anchorCtr="0" forceAA="0" compatLnSpc="1">
+                        <a:prstTxWarp prst="textNoShape">
+                          <a:avLst/>
+                        </a:prstTxWarp>
+                        <a:noAutofit/>
+                      </wps:bodyPr>
+                    </wps:wsp>
+                  </a:graphicData>
+                </a:graphic>
+                <wp14:sizeRelH relativeFrom="margin">
+                  <wp14:pctWidth>0</wp14:pctWidth>
+                </wp14:sizeRelH>
+                <wp14:sizeRelV relativeFrom="margin">
+                  <wp14:pctHeight>0</wp14:pctHeight>
+                </wp14:sizeRelV>
+              </wp:anchor>
+            </w:drawing>
+          </mc:Choice>
+          <mc:Fallback>
+            <w:pict>
+              <v:shape w14:anchorId="22D60C68" id="Equal 21" o:spid="_x0000_s1026" style="position:absolute;margin-left:-66.2pt;margin-top:16.7pt;width:492.75pt;height:10.05pt;z-index:251669568;visibility:visible;mso-wrap-style:square;mso-width-percent:0;mso-height-percent:0;mso-wrap-distance-left:9pt;mso-wrap-distance-top:0;mso-wrap-distance-right:9pt;mso-wrap-distance-bottom:0;mso-position-horizontal:absolute;mso-position-horizontal-relative:text;mso-position-vertical:absolute;mso-position-vertical-relative:text;mso-width-percent:0;mso-height-percent:0;mso-width-relative:margin;mso-height-relative:margin;v-text-anchor:middle" coordsize="6257925,127635" o:gfxdata="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" path="m829488,42448r4598949,l5428437,51745r-4598949,l829488,42448xm829488,75890r4598949,l5428437,85187r-4598949,l829488,75890xe" fillcolor="#d8d8d8 [2732]" stroked="f" strokeweight="1pt">
+                <v:stroke joinstyle="miter"/>
+                <v:path arrowok="t" o:connecttype="custom" o:connectlocs="829488,42448;5428437,42448;5428437,51745;829488,51745;829488,42448;829488,75890;5428437,75890;5428437,85187;829488,85187;829488,75890" o:connectangles="0,0,0,0,0,0,0,0,0,0"/>
+              </v:shape>
+            </w:pict>
+          </mc:Fallback>
+        </mc:AlternateContent>
+      </w:r>
+      <w:r>
+        <w:t>8.</w:t>
+      </w:r>
+      <w:r>
+        <w:t>3</w:t>
+      </w:r>
+      <w:r>
+        <w:t xml:space="preserve"> </w:t>
+      </w:r>
+      <w:r>
+        <w:t>Roles del Equipo</w:t>
+      </w:r>
+      <w:bookmarkEnd w:id="34"/>
+    </w:p>
+    <w:p>
+      <w:pPr>
+        <w:spacing w:line="276" w:lineRule="auto"/>
+        <w:ind w:left="708"/>
+        <w:jc w:val="both"/>
+        <w:rPr>
+          <w:rFonts w:ascii="Baskerville" w:hAnsi="Baskerville"/>
+          <w:sz w:val="24"/>
+          <w:szCs w:val="24"/>
+          <w:lang w:val="en-MX"/>
+        </w:rPr>
+      </w:pPr>
+      <w:r>
+        <w:rPr>
+          <w:rFonts w:ascii="Segoe UI Symbol" w:hAnsi="Segoe UI Symbol" w:cs="Segoe UI Symbol"/>
+          <w:sz w:val="24"/>
+          <w:szCs w:val="24"/>
+          <w:lang w:val="en-MX"/>
+        </w:rPr>
+        <w:t>❖</w:t>
+      </w:r>
+      <w:r>
+        <w:rPr>
+          <w:rFonts w:ascii="Baskerville" w:hAnsi="Baskerville"/>
+          <w:sz w:val="24"/>
+          <w:szCs w:val="24"/>
+          <w:lang w:val="en-MX"/>
+        </w:rPr>
+        <w:t xml:space="preserve"> PM / PMO (Angel Cruz): </w:t>
+      </w:r>
+    </w:p>
+    <w:p>
+      <w:pPr>
+        <w:spacing w:line="276" w:lineRule="auto"/>
+        <w:ind w:left="1416" w:firstLine="708"/>
+        <w:jc w:val="both"/>
+        <w:rPr>
+          <w:rFonts w:ascii="Baskerville" w:hAnsi="Baskerville"/>
+          <w:sz w:val="24"/>
+          <w:szCs w:val="24"/>
+          <w:lang w:val="en-MX"/>
+        </w:rPr>
+      </w:pPr>
+      <w:r>
+        <w:rPr>
+          <w:rFonts w:ascii="Baskerville" w:hAnsi="Baskerville"/>
+          <w:sz w:val="24"/>
+          <w:szCs w:val="24"/>
+          <w:lang w:val="en-MX"/>
+        </w:rPr>
+        <w:t>Project Manager y Project Management Office.</w:t>
+      </w:r>
+    </w:p>
+    <w:p>
+      <w:pPr>
+        <w:spacing w:line="276" w:lineRule="auto"/>
+        <w:ind w:left="708"/>
+        <w:jc w:val="both"/>
+        <w:rPr>
+          <w:rFonts w:ascii="Baskerville" w:hAnsi="Baskerville"/>
+          <w:sz w:val="24"/>
+          <w:szCs w:val="24"/>
+          <w:lang w:val="en-MX"/>
+        </w:rPr>
+      </w:pPr>
+      <w:r>
+        <w:rPr>
+          <w:rFonts w:ascii="Segoe UI Symbol" w:hAnsi="Segoe UI Symbol" w:cs="Segoe UI Symbol"/>
+          <w:sz w:val="24"/>
+          <w:szCs w:val="24"/>
+          <w:lang w:val="en-MX"/>
+        </w:rPr>
+        <w:t>❖</w:t>
+      </w:r>
+      <w:r>
+        <w:rPr>
+          <w:rFonts w:ascii="Baskerville" w:hAnsi="Baskerville"/>
+          <w:sz w:val="24"/>
+          <w:szCs w:val="24"/>
+          <w:lang w:val="en-MX"/>
+        </w:rPr>
+        <w:t xml:space="preserve"> PO / Stakeholders (Diamdon Event &amp; Tent): </w:t>
+      </w:r>
+    </w:p>
+    <w:p>
+      <w:pPr>
+        <w:spacing w:line="276" w:lineRule="auto"/>
+        <w:ind w:left="1416" w:firstLine="708"/>
+        <w:jc w:val="both"/>
+        <w:rPr>
+          <w:rFonts w:ascii="Baskerville" w:hAnsi="Baskerville"/>
+          <w:sz w:val="24"/>
+          <w:szCs w:val="24"/>
+          <w:lang w:val="en-MX"/>
+        </w:rPr>
+      </w:pPr>
+      <w:r>
+        <w:rPr>
+          <w:rFonts w:ascii="Baskerville" w:hAnsi="Baskerville"/>
+          <w:sz w:val="24"/>
+          <w:szCs w:val="24"/>
+          <w:lang w:val="en-MX"/>
+        </w:rPr>
+        <w:t>Product Owner y los interesados del negocio.</w:t>
+      </w:r>
+    </w:p>
+    <w:p>
+      <w:pPr>
+        <w:spacing w:line="276" w:lineRule="auto"/>
+        <w:ind w:left="708"/>
+        <w:jc w:val="both"/>
+        <w:rPr>
+          <w:rFonts w:ascii="Baskerville" w:hAnsi="Baskerville"/>
+          <w:sz w:val="24"/>
+          <w:szCs w:val="24"/>
+          <w:lang w:val="en-MX"/>
+        </w:rPr>
+      </w:pPr>
+      <w:r>
+        <w:rPr>
+          <w:rFonts w:ascii="Segoe UI Symbol" w:hAnsi="Segoe UI Symbol" w:cs="Segoe UI Symbol"/>
+          <w:sz w:val="24"/>
+          <w:szCs w:val="24"/>
+          <w:lang w:val="en-MX"/>
+        </w:rPr>
+        <w:t>❖</w:t>
+      </w:r>
+      <w:r>
+        <w:rPr>
+          <w:rFonts w:ascii="Baskerville" w:hAnsi="Baskerville"/>
+          <w:sz w:val="24"/>
+          <w:szCs w:val="24"/>
+          <w:lang w:val="en-MX"/>
+        </w:rPr>
+        <w:t xml:space="preserve"> Analista (Cesar Arrioja): </w:t>
+      </w:r>
+    </w:p>
+    <w:p>
+      <w:pPr>
+        <w:spacing w:line="276" w:lineRule="auto"/>
+        <w:ind w:left="1416" w:firstLine="708"/>
+        <w:jc w:val="both"/>
+        <w:rPr>
+          <w:rFonts w:ascii="Baskerville" w:hAnsi="Baskerville"/>
+          <w:sz w:val="24"/>
+          <w:szCs w:val="24"/>
+          <w:lang w:val="en-MX"/>
+        </w:rPr>
+      </w:pPr>
+      <w:r>
+        <w:rPr>
+          <w:rFonts w:ascii="Baskerville" w:hAnsi="Baskerville"/>
+          <w:sz w:val="24"/>
+          <w:szCs w:val="24"/>
+          <w:lang w:val="en-MX"/>
+        </w:rPr>
+        <w:t>Analista Funcional y Analista de Procesos.</w:t>
+      </w:r>
+    </w:p>
+    <w:p>
+      <w:pPr>
+        <w:spacing w:line="276" w:lineRule="auto"/>
+        <w:ind w:left="708"/>
+        <w:jc w:val="both"/>
+        <w:rPr>
+          <w:rFonts w:ascii="Baskerville" w:hAnsi="Baskerville"/>
+          <w:sz w:val="24"/>
+          <w:szCs w:val="24"/>
+          <w:lang w:val="en-MX"/>
+        </w:rPr>
+      </w:pPr>
+      <w:r>
+        <w:rPr>
+          <w:rFonts w:ascii="Segoe UI Symbol" w:hAnsi="Segoe UI Symbol" w:cs="Segoe UI Symbol"/>
+          <w:sz w:val="24"/>
+          <w:szCs w:val="24"/>
+          <w:lang w:val="en-MX"/>
+        </w:rPr>
+        <w:t>❖</w:t>
+      </w:r>
+      <w:r>
+        <w:rPr>
+          <w:rFonts w:ascii="Baskerville" w:hAnsi="Baskerville"/>
+          <w:sz w:val="24"/>
+          <w:szCs w:val="24"/>
+          <w:lang w:val="en-MX"/>
+        </w:rPr>
+        <w:t xml:space="preserve"> Arq. SW / DBA / CISO (Angel Cruz &amp; Cesar Arrioja): </w:t>
+      </w:r>
+    </w:p>
+    <w:p>
+      <w:pPr>
+        <w:spacing w:line="276" w:lineRule="auto"/>
+        <w:ind w:left="2124"/>
+        <w:jc w:val="both"/>
+        <w:rPr>
+          <w:rFonts w:ascii="Baskerville" w:hAnsi="Baskerville"/>
+          <w:sz w:val="24"/>
+          <w:szCs w:val="24"/>
+          <w:lang w:val="en-MX"/>
+        </w:rPr>
+      </w:pPr>
+      <w:r>
+        <w:rPr>
+          <w:rFonts w:ascii="Baskerville" w:hAnsi="Baskerville"/>
+          <w:sz w:val="24"/>
+          <w:szCs w:val="24"/>
+          <w:lang w:val="en-MX"/>
+        </w:rPr>
+        <w:t>Arquitecto de Software, Administrador de Base de Datos y Oficial de Seguridad de</w:t>
+      </w:r>
+      <w:r>
+        <w:rPr>
+          <w:rFonts w:ascii="Baskerville" w:hAnsi="Baskerville"/>
+          <w:sz w:val="24"/>
+          <w:szCs w:val="24"/>
+          <w:lang w:val="en-MX"/>
+        </w:rPr>
+        <w:t xml:space="preserve"> </w:t>
+      </w:r>
+      <w:r>
+        <w:rPr>
+          <w:rFonts w:ascii="Baskerville" w:hAnsi="Baskerville"/>
+          <w:sz w:val="24"/>
+          <w:szCs w:val="24"/>
+          <w:lang w:val="en-MX"/>
+        </w:rPr>
+        <w:t>la Información.</w:t>
+      </w:r>
+    </w:p>
+    <w:p>
+      <w:pPr>
+        <w:spacing w:line="276" w:lineRule="auto"/>
+        <w:ind w:left="708"/>
+        <w:jc w:val="both"/>
+        <w:rPr>
+          <w:rFonts w:ascii="Baskerville" w:hAnsi="Baskerville"/>
+          <w:sz w:val="24"/>
+          <w:szCs w:val="24"/>
+          <w:lang w:val="en-MX"/>
+        </w:rPr>
+      </w:pPr>
+      <w:r>
+        <w:rPr>
+          <w:rFonts w:ascii="Segoe UI Symbol" w:hAnsi="Segoe UI Symbol" w:cs="Segoe UI Symbol"/>
+          <w:sz w:val="24"/>
+          <w:szCs w:val="24"/>
+          <w:lang w:val="en-MX"/>
+        </w:rPr>
+        <w:t>❖</w:t>
+      </w:r>
+      <w:r>
+        <w:rPr>
+          <w:rFonts w:ascii="Baskerville" w:hAnsi="Baskerville"/>
+          <w:sz w:val="24"/>
+          <w:szCs w:val="24"/>
+          <w:lang w:val="en-MX"/>
+        </w:rPr>
+        <w:t xml:space="preserve"> Desarrolladores (Angel Cruz &amp; Cesar Arrioja): </w:t>
+      </w:r>
+    </w:p>
+    <w:p>
+      <w:pPr>
+        <w:spacing w:line="276" w:lineRule="auto"/>
+        <w:ind w:left="1416" w:firstLine="708"/>
+        <w:jc w:val="both"/>
+        <w:rPr>
+          <w:rFonts w:ascii="Baskerville" w:hAnsi="Baskerville"/>
+          <w:sz w:val="24"/>
+          <w:szCs w:val="24"/>
+          <w:lang w:val="en-MX"/>
+        </w:rPr>
+      </w:pPr>
+      <w:r>
+        <w:rPr>
+          <w:rFonts w:ascii="Baskerville" w:hAnsi="Baskerville"/>
+          <w:sz w:val="24"/>
+          <w:szCs w:val="24"/>
+          <w:lang w:val="en-MX"/>
+        </w:rPr>
+        <w:t>Dev Backend, Dev Frontend (Oficina) y Dev Mobile/Web (Drivers).</w:t>
+      </w:r>
+    </w:p>
+    <w:p>
+      <w:pPr>
+        <w:spacing w:line="276" w:lineRule="auto"/>
+        <w:ind w:left="708"/>
+        <w:jc w:val="both"/>
+        <w:rPr>
+          <w:rFonts w:ascii="Baskerville" w:hAnsi="Baskerville"/>
+          <w:sz w:val="24"/>
+          <w:szCs w:val="24"/>
+          <w:lang w:val="en-MX"/>
+        </w:rPr>
+      </w:pPr>
+      <w:r>
+        <w:rPr>
+          <w:rFonts w:ascii="Segoe UI Symbol" w:hAnsi="Segoe UI Symbol" w:cs="Segoe UI Symbol"/>
+          <w:sz w:val="24"/>
+          <w:szCs w:val="24"/>
+          <w:lang w:val="en-MX"/>
+        </w:rPr>
+        <w:t>❖</w:t>
+      </w:r>
+      <w:r>
+        <w:rPr>
+          <w:rFonts w:ascii="Baskerville" w:hAnsi="Baskerville"/>
+          <w:sz w:val="24"/>
+          <w:szCs w:val="24"/>
+          <w:lang w:val="en-MX"/>
+        </w:rPr>
+        <w:t xml:space="preserve"> QA (Cesar Arrioja): </w:t>
+      </w:r>
+    </w:p>
+    <w:p>
+      <w:pPr>
+        <w:spacing w:line="276" w:lineRule="auto"/>
+        <w:ind w:left="1416" w:firstLine="708"/>
+        <w:jc w:val="both"/>
+        <w:rPr>
+          <w:rFonts w:ascii="Baskerville" w:hAnsi="Baskerville"/>
+          <w:sz w:val="24"/>
+          <w:szCs w:val="24"/>
+          <w:lang w:val="en-MX"/>
+        </w:rPr>
+      </w:pPr>
+      <w:r>
+        <w:rPr>
+          <w:rFonts w:ascii="Baskerville" w:hAnsi="Baskerville"/>
+          <w:sz w:val="24"/>
+          <w:szCs w:val="24"/>
+          <w:lang w:val="en-MX"/>
+        </w:rPr>
+        <w:t>QA Lead y QA Tester.</w:t>
+      </w:r>
+    </w:p>
+    <w:p>
+      <w:pPr>
+        <w:spacing w:line="276" w:lineRule="auto"/>
+        <w:jc w:val="both"/>
+        <w:rPr>
+          <w:rFonts w:ascii="Baskerville" w:hAnsi="Baskerville"/>
+          <w:sz w:val="24"/>
+          <w:szCs w:val="24"/>
+        </w:rPr>
+      </w:pPr>
+    </w:p>
+    <w:p>
+      <w:pPr>
+        <w:spacing w:line="276" w:lineRule="auto"/>
+        <w:jc w:val="both"/>
+        <w:rPr>
+          <w:rFonts w:ascii="Baskerville" w:hAnsi="Baskerville"/>
+          <w:sz w:val="24"/>
+          <w:szCs w:val="24"/>
         </w:rPr>
       </w:pPr>
     </w:p>
@@ -16819,7 +18198,7 @@
         </mc:AlternateContent>
       </w:r>
     </w:p>
-    <w:bookmarkStart w:id="31" w:name="_Toc230112863"/>
+    <w:bookmarkStart w:id="35" w:name="_Toc230301216"/>
     <w:p>
       <w:pPr>
         <w:pStyle w:val="Heading1"/>
@@ -16828,11 +18207,6 @@
         </w:rPr>
       </w:pPr>
       <w:r>
-        <w:rPr>
-          <w:noProof/>
-          <w:sz w:val="44"/>
-          <w:szCs w:val="40"/>
-        </w:rPr>
         <mc:AlternateContent>
           <mc:Choice Requires="wps">
             <w:drawing>
@@ -16918,13 +18292,9 @@
         </mc:AlternateContent>
       </w:r>
       <w:r>
-        <w:rPr>
-          <w:sz w:val="44"/>
-          <w:szCs w:val="40"/>
-        </w:rPr>
         <w:t>14. Anexos</w:t>
       </w:r>
-      <w:bookmarkEnd w:id="31"/>
+      <w:bookmarkEnd w:id="35"/>
     </w:p>
     <w:p>
       <w:pPr>
@@ -16976,7 +18346,7 @@
                     </pic:cNvPicPr>
                   </pic:nvPicPr>
                   <pic:blipFill>
-                    <a:blip r:embed="rId21" cstate="print">
+                    <a:blip r:embed="rId27" cstate="print">
                       <a:extLst>
                         <a:ext uri="{28A0092B-C50C-407E-A947-70E740481C1C}">
                           <a14:useLocalDpi xmlns:a14="http://schemas.microsoft.com/office/drawing/2010/main" val="0"/>
@@ -17047,7 +18417,7 @@
           <w:noProof/>
         </w:rPr>
         <w:drawing>
-          <wp:anchor distT="0" distB="0" distL="114300" distR="114300" simplePos="0" relativeHeight="251658245" behindDoc="0" locked="0" layoutInCell="1" allowOverlap="1" wp14:anchorId="3DBA43CC" wp14:editId="6A94E204">
+          <wp:anchor distT="0" distB="0" distL="114300" distR="114300" simplePos="0" relativeHeight="251658245" behindDoc="0" locked="0" layoutInCell="1" allowOverlap="1" wp14:anchorId="3DBA43CC" wp14:editId="3E8E8756">
             <wp:simplePos x="0" y="0"/>
             <wp:positionH relativeFrom="margin">
               <wp:posOffset>3204845</wp:posOffset>
@@ -17070,7 +18440,7 @@
                     <pic:cNvPicPr/>
                   </pic:nvPicPr>
                   <pic:blipFill>
-                    <a:blip r:embed="rId22" cstate="print">
+                    <a:blip r:embed="rId28" cstate="print">
                       <a:extLst>
                         <a:ext uri="{28A0092B-C50C-407E-A947-70E740481C1C}">
                           <a14:useLocalDpi xmlns:a14="http://schemas.microsoft.com/office/drawing/2010/main" val="0"/>
@@ -17428,7 +18798,7 @@
           <w:highlight w:val="black"/>
         </w:rPr>
         <w:drawing>
-          <wp:anchor distT="0" distB="0" distL="114300" distR="114300" simplePos="0" relativeHeight="251658282" behindDoc="0" locked="0" layoutInCell="1" allowOverlap="1" wp14:anchorId="7E843AAA" wp14:editId="7B1B8A48">
+          <wp:anchor distT="0" distB="0" distL="114300" distR="114300" simplePos="0" relativeHeight="251658282" behindDoc="0" locked="0" layoutInCell="1" allowOverlap="1" wp14:anchorId="7E843AAA" wp14:editId="651054B5">
             <wp:simplePos x="0" y="0"/>
             <wp:positionH relativeFrom="margin">
               <wp:posOffset>-242570</wp:posOffset>
@@ -17453,7 +18823,7 @@
                     </pic:cNvPicPr>
                   </pic:nvPicPr>
                   <pic:blipFill>
-                    <a:blip r:embed="rId23" cstate="print">
+                    <a:blip r:embed="rId29" cstate="print">
                       <a:extLst>
                         <a:ext uri="{28A0092B-C50C-407E-A947-70E740481C1C}">
                           <a14:useLocalDpi xmlns:a14="http://schemas.microsoft.com/office/drawing/2010/main" val="0"/>
@@ -17548,7 +18918,7 @@
                     </pic:cNvPicPr>
                   </pic:nvPicPr>
                   <pic:blipFill rotWithShape="1">
-                    <a:blip r:embed="rId24" cstate="print">
+                    <a:blip r:embed="rId30" cstate="print">
                       <a:extLst>
                         <a:ext uri="{28A0092B-C50C-407E-A947-70E740481C1C}">
                           <a14:useLocalDpi xmlns:a14="http://schemas.microsoft.com/office/drawing/2010/main" val="0"/>
@@ -17851,10 +19221,10 @@
                             </pic:cNvPicPr>
                           </pic:nvPicPr>
                           <pic:blipFill>
-                            <a:blip r:embed="rId25">
+                            <a:blip r:embed="rId31">
                               <a:extLst>
                                 <a:ext uri="{96DAC541-7B7A-43D3-8B79-37D633B846F1}">
-                                  <asvg:svgBlip xmlns:asvg="http://schemas.microsoft.com/office/drawing/2016/SVG/main" r:embed="rId26"/>
+                                  <asvg:svgBlip xmlns:asvg="http://schemas.microsoft.com/office/drawing/2016/SVG/main" r:embed="rId32"/>
                                 </a:ext>
                               </a:extLst>
                             </a:blip>
@@ -18722,10 +20092,10 @@
                             </pic:cNvPicPr>
                           </pic:nvPicPr>
                           <pic:blipFill>
-                            <a:blip r:embed="rId25">
+                            <a:blip r:embed="rId31">
                               <a:extLst>
                                 <a:ext uri="{96DAC541-7B7A-43D3-8B79-37D633B846F1}">
-                                  <asvg:svgBlip xmlns:asvg="http://schemas.microsoft.com/office/drawing/2016/SVG/main" r:embed="rId26"/>
+                                  <asvg:svgBlip xmlns:asvg="http://schemas.microsoft.com/office/drawing/2016/SVG/main" r:embed="rId32"/>
                                 </a:ext>
                               </a:extLst>
                             </a:blip>
@@ -19440,7 +20810,7 @@
                     <o:lock v:ext="edit" aspectratio="t"/>
                   </v:shapetype>
                   <v:shape id="Gráfico 11" o:spid="_x0000_s1039" type="#_x0000_t75" alt="Base de datos con relleno sólido" style="position:absolute;left:10508;top:14958;width:5868;height:5867;visibility:visible;mso-wrap-style:square" o:gfxdata="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">
-                    <v:imagedata r:id="rId27" o:title="Base de datos con relleno sólido"/>
+                    <v:imagedata r:id="rId33" o:title="Base de datos con relleno sólido"/>
                   </v:shape>
                   <v:roundrect id="Rectángulo: esquinas redondeadas 18" o:spid="_x0000_s1040" style="position:absolute;left:1091;top:4927;width:9758;height:4504;visibility:visible;mso-wrap-style:square;v-text-anchor:middle" arcsize="10923f" o:gfxdata="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" filled="f" strokecolor="#091723 [484]" strokeweight="1.5pt">
                     <v:stroke joinstyle="miter"/>
@@ -19719,7 +21089,7 @@
                     </v:textbox>
                   </v:roundrect>
                   <v:shape id="Gráfico 11" o:spid="_x0000_s1049" type="#_x0000_t75" alt="Base de datos con relleno sólido" style="position:absolute;left:10645;top:28333;width:5867;height:5867;visibility:visible;mso-wrap-style:square" o:gfxdata="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">
-                    <v:imagedata r:id="rId27" o:title="Base de datos con relleno sólido"/>
+                    <v:imagedata r:id="rId33" o:title="Base de datos con relleno sólido"/>
                   </v:shape>
                   <v:roundrect id="Rectángulo: esquinas redondeadas 18" o:spid="_x0000_s1050" style="position:absolute;left:15831;top:8680;width:10166;height:4159;visibility:visible;mso-wrap-style:square;v-text-anchor:middle" arcsize="10923f" o:gfxdata="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" filled="f" strokecolor="#091723 [484]" strokeweight="1.5pt">
                     <v:stroke joinstyle="miter"/>
@@ -19903,11 +21273,9 @@
       </w:pPr>
     </w:p>
     <w:sectPr>
-      <w:headerReference w:type="default" r:id="rId28"/>
-      <w:footerReference w:type="default" r:id="rId29"/>
       <w:pgSz w:w="12240" w:h="15840"/>
       <w:pgMar w:top="1417" w:right="1701" w:bottom="1417" w:left="1701" w:header="708" w:footer="708" w:gutter="0"/>
-      <w:pgNumType w:start="1" w:chapStyle="1"/>
+      <w:pgNumType w:chapStyle="1"/>
       <w:cols w:space="708"/>
       <w:docGrid w:linePitch="360"/>
     </w:sectPr>
@@ -20138,6 +21506,11 @@
         <w:docPartUnique/>
       </w:docPartObj>
     </w:sdtPr>
+    <w:sdtEndPr>
+      <w:rPr>
+        <w:rStyle w:val="PageNumber"/>
+      </w:rPr>
+    </w:sdtEndPr>
     <w:sdtContent>
       <w:p>
         <w:pPr>
@@ -20632,6 +22005,214 @@
 </w:hdr>
 </file>
 
+<file path=word/header5.xml><?xml version="1.0" encoding="utf-8"?>
+<w:hdr xmlns:wpc="http://schemas.microsoft.com/office/word/2010/wordprocessingCanvas" xmlns:cx="http://schemas.microsoft.com/office/drawing/2014/chartex" xmlns:cx1="http://schemas.microsoft.com/office/drawing/2015/9/8/chartex" xmlns:cx2="http://schemas.microsoft.com/office/drawing/2015/10/21/chartex" xmlns:cx3="http://schemas.microsoft.com/office/drawing/2016/5/9/chartex" xmlns:cx4="http://schemas.microsoft.com/office/drawing/2016/5/10/chartex" xmlns:cx5="http://schemas.microsoft.com/office/drawing/2016/5/11/chartex" xmlns:cx6="http://schemas.microsoft.com/office/drawing/2016/5/12/chartex" xmlns:cx7="http://schemas.microsoft.com/office/drawing/2016/5/13/chartex" xmlns:cx8="http://schemas.microsoft.com/office/drawing/2016/5/14/chartex" xmlns:mc="http://schemas.openxmlformats.org/markup-compatibility/2006" xmlns:aink="http://schemas.microsoft.com/office/drawing/2016/ink" xmlns:am3d="http://schemas.microsoft.com/office/drawing/2017/model3d" xmlns:o="urn:schemas-microsoft-com:office:office" xmlns:oel="http://schemas.microsoft.com/office/2019/extlst" xmlns:r="http://schemas.openxmlformats.org/officeDocument/2006/relationships" xmlns:m="http://schemas.openxmlformats.org/officeDocument/2006/math" xmlns:v="urn:schemas-microsoft-com:vml" xmlns:wp14="http://schemas.microsoft.com/office/word/2010/wordprocessingDrawing" xmlns:wp="http://schemas.openxmlformats.org/drawingml/2006/wordprocessingDrawing" xmlns:w10="urn:schemas-microsoft-com:office:word" xmlns:w="http://schemas.openxmlformats.org/wordprocessingml/2006/main" xmlns:w14="http://schemas.microsoft.com/office/word/2010/wordml" xmlns:w15="http://schemas.microsoft.com/office/word/2012/wordml" xmlns:w16cex="http://schemas.microsoft.com/office/word/2018/wordml/cex" xmlns:w16cid="http://schemas.microsoft.com/office/word/2016/wordml/cid" xmlns:w16="http://schemas.microsoft.com/office/word/2018/wordml" xmlns:w16du="http://schemas.microsoft.com/office/word/2023/wordml/word16du" xmlns:w16sdtdh="http://schemas.microsoft.com/office/word/2020/wordml/sdtdatahash" xmlns:w16sdtfl="http://schemas.microsoft.com/office/word/2024/wordml/sdtformatlock" xmlns:w16se="http://schemas.microsoft.com/office/word/2015/wordml/symex" xmlns:wpg="http://schemas.microsoft.com/office/word/2010/wordprocessingGroup" xmlns:wpi="http://schemas.microsoft.com/office/word/2010/wordprocessingInk" xmlns:wne="http://schemas.microsoft.com/office/word/2006/wordml" xmlns:wps="http://schemas.microsoft.com/office/word/2010/wordprocessingShape" mc:Ignorable="w14 w15 w16se w16cid w16 w16cex w16sdtdh w16sdtfl w16du wp14">
+  <w:tbl>
+    <w:tblPr>
+      <w:tblW w:w="0" w:type="auto"/>
+      <w:tblLayout w:type="fixed"/>
+      <w:tblLook w:val="06A0" w:firstRow="1" w:lastRow="0" w:firstColumn="1" w:lastColumn="0" w:noHBand="1" w:noVBand="1"/>
+    </w:tblPr>
+    <w:tblGrid>
+      <w:gridCol w:w="2945"/>
+      <w:gridCol w:w="2945"/>
+      <w:gridCol w:w="2945"/>
+    </w:tblGrid>
+    <w:tr>
+      <w:trPr>
+        <w:trHeight w:val="300"/>
+      </w:trPr>
+      <w:tc>
+        <w:tcPr>
+          <w:tcW w:w="2945" w:type="dxa"/>
+        </w:tcPr>
+        <w:p>
+          <w:pPr>
+            <w:pStyle w:val="Header"/>
+            <w:ind w:left="-115" w:right="360"/>
+          </w:pPr>
+        </w:p>
+      </w:tc>
+      <w:tc>
+        <w:tcPr>
+          <w:tcW w:w="2945" w:type="dxa"/>
+        </w:tcPr>
+        <w:p>
+          <w:pPr>
+            <w:pStyle w:val="Header"/>
+            <w:jc w:val="center"/>
+          </w:pPr>
+        </w:p>
+      </w:tc>
+      <w:tc>
+        <w:tcPr>
+          <w:tcW w:w="2945" w:type="dxa"/>
+        </w:tcPr>
+        <w:p>
+          <w:pPr>
+            <w:pStyle w:val="Header"/>
+            <w:ind w:right="-115"/>
+            <w:jc w:val="right"/>
+          </w:pPr>
+          <w:r>
+            <w:fldChar w:fldCharType="begin"/>
+          </w:r>
+          <w:r>
+            <w:instrText xml:space="preserve"> INCLUDEPICTURE "https://www.rockymountainbride.com/wp-content/uploads/2021/12/diamond_logo_smaller_1.jpg" \* MERGEFORMATINET </w:instrText>
+          </w:r>
+          <w:r>
+            <w:fldChar w:fldCharType="separate"/>
+          </w:r>
+          <w:r>
+            <w:fldChar w:fldCharType="end"/>
+          </w:r>
+        </w:p>
+      </w:tc>
+    </w:tr>
+  </w:tbl>
+  <w:p>
+    <w:pPr>
+      <w:pStyle w:val="Header"/>
+    </w:pPr>
+    <w:r>
+      <w:rPr>
+        <w:noProof/>
+      </w:rPr>
+      <w:drawing>
+        <wp:anchor distT="0" distB="0" distL="114300" distR="114300" simplePos="0" relativeHeight="251661313" behindDoc="0" locked="0" layoutInCell="1" allowOverlap="1" wp14:anchorId="55125631" wp14:editId="3B818080">
+          <wp:simplePos x="0" y="0"/>
+          <wp:positionH relativeFrom="column">
+            <wp:posOffset>5760581</wp:posOffset>
+          </wp:positionH>
+          <wp:positionV relativeFrom="paragraph">
+            <wp:posOffset>-441159</wp:posOffset>
+          </wp:positionV>
+          <wp:extent cx="688975" cy="530225"/>
+          <wp:effectExtent l="0" t="0" r="0" b="3175"/>
+          <wp:wrapNone/>
+          <wp:docPr id="220632337" name="Picture 23" descr="Diamond Event &amp; Tent | Utah Wedding Rentals"/>
+          <wp:cNvGraphicFramePr>
+            <a:graphicFrameLocks xmlns:a="http://schemas.openxmlformats.org/drawingml/2006/main" noChangeAspect="1"/>
+          </wp:cNvGraphicFramePr>
+          <a:graphic xmlns:a="http://schemas.openxmlformats.org/drawingml/2006/main">
+            <a:graphicData uri="http://schemas.openxmlformats.org/drawingml/2006/picture">
+              <pic:pic xmlns:pic="http://schemas.openxmlformats.org/drawingml/2006/picture">
+                <pic:nvPicPr>
+                  <pic:cNvPr id="0" name="Picture 1" descr="Diamond Event &amp; Tent | Utah Wedding Rentals"/>
+                  <pic:cNvPicPr>
+                    <a:picLocks noChangeAspect="1" noChangeArrowheads="1"/>
+                  </pic:cNvPicPr>
+                </pic:nvPicPr>
+                <pic:blipFill>
+                  <a:blip r:embed="rId1">
+                    <a:extLst>
+                      <a:ext uri="{28A0092B-C50C-407E-A947-70E740481C1C}">
+                        <a14:useLocalDpi xmlns:a14="http://schemas.microsoft.com/office/drawing/2010/main" val="0"/>
+                      </a:ext>
+                    </a:extLst>
+                  </a:blip>
+                  <a:srcRect/>
+                  <a:stretch>
+                    <a:fillRect/>
+                  </a:stretch>
+                </pic:blipFill>
+                <pic:spPr bwMode="auto">
+                  <a:xfrm>
+                    <a:off x="0" y="0"/>
+                    <a:ext cx="688975" cy="530225"/>
+                  </a:xfrm>
+                  <a:prstGeom prst="rect">
+                    <a:avLst/>
+                  </a:prstGeom>
+                  <a:noFill/>
+                  <a:ln>
+                    <a:noFill/>
+                  </a:ln>
+                </pic:spPr>
+              </pic:pic>
+            </a:graphicData>
+          </a:graphic>
+          <wp14:sizeRelH relativeFrom="page">
+            <wp14:pctWidth>0</wp14:pctWidth>
+          </wp14:sizeRelH>
+          <wp14:sizeRelV relativeFrom="page">
+            <wp14:pctHeight>0</wp14:pctHeight>
+          </wp14:sizeRelV>
+        </wp:anchor>
+      </w:drawing>
+    </w:r>
+    <w:r>
+      <w:rPr>
+        <w:rFonts w:ascii="Aptos Display" w:hAnsi="Aptos Display"/>
+        <w:noProof/>
+      </w:rPr>
+      <w:drawing>
+        <wp:anchor distT="0" distB="0" distL="114300" distR="114300" simplePos="0" relativeHeight="251660289" behindDoc="0" locked="0" layoutInCell="1" allowOverlap="1" wp14:anchorId="722B7B26" wp14:editId="09205A0B">
+          <wp:simplePos x="0" y="0"/>
+          <wp:positionH relativeFrom="column">
+            <wp:posOffset>-619203</wp:posOffset>
+          </wp:positionH>
+          <wp:positionV relativeFrom="paragraph">
+            <wp:posOffset>-375008</wp:posOffset>
+          </wp:positionV>
+          <wp:extent cx="374744" cy="318053"/>
+          <wp:effectExtent l="0" t="0" r="0" b="0"/>
+          <wp:wrapNone/>
+          <wp:docPr id="562050890" name="Imagen 11"/>
+          <wp:cNvGraphicFramePr>
+            <a:graphicFrameLocks xmlns:a="http://schemas.openxmlformats.org/drawingml/2006/main" noChangeAspect="1"/>
+          </wp:cNvGraphicFramePr>
+          <a:graphic xmlns:a="http://schemas.openxmlformats.org/drawingml/2006/main">
+            <a:graphicData uri="http://schemas.openxmlformats.org/drawingml/2006/picture">
+              <pic:pic xmlns:pic="http://schemas.openxmlformats.org/drawingml/2006/picture">
+                <pic:nvPicPr>
+                  <pic:cNvPr id="0" name="Picture 8"/>
+                  <pic:cNvPicPr>
+                    <a:picLocks noChangeAspect="1" noChangeArrowheads="1"/>
+                  </pic:cNvPicPr>
+                </pic:nvPicPr>
+                <pic:blipFill>
+                  <a:blip r:embed="rId2" cstate="print">
+                    <a:extLst>
+                      <a:ext uri="{28A0092B-C50C-407E-A947-70E740481C1C}">
+                        <a14:useLocalDpi xmlns:a14="http://schemas.microsoft.com/office/drawing/2010/main" val="0"/>
+                      </a:ext>
+                    </a:extLst>
+                  </a:blip>
+                  <a:srcRect/>
+                  <a:stretch>
+                    <a:fillRect/>
+                  </a:stretch>
+                </pic:blipFill>
+                <pic:spPr bwMode="auto">
+                  <a:xfrm>
+                    <a:off x="0" y="0"/>
+                    <a:ext cx="374744" cy="318053"/>
+                  </a:xfrm>
+                  <a:prstGeom prst="rect">
+                    <a:avLst/>
+                  </a:prstGeom>
+                  <a:noFill/>
+                  <a:ln>
+                    <a:noFill/>
+                  </a:ln>
+                </pic:spPr>
+              </pic:pic>
+            </a:graphicData>
+          </a:graphic>
+          <wp14:sizeRelH relativeFrom="page">
+            <wp14:pctWidth>0</wp14:pctWidth>
+          </wp14:sizeRelH>
+          <wp14:sizeRelV relativeFrom="page">
+            <wp14:pctHeight>0</wp14:pctHeight>
+          </wp14:sizeRelV>
+        </wp:anchor>
+      </w:drawing>
+    </w:r>
+  </w:p>
+</w:hdr>
+</file>
+
 <file path=word/numbering.xml><?xml version="1.0" encoding="utf-8"?>
 <w:numbering xmlns:wpc="http://schemas.microsoft.com/office/word/2010/wordprocessingCanvas" xmlns:cx="http://schemas.microsoft.com/office/drawing/2014/chartex" xmlns:cx1="http://schemas.microsoft.com/office/drawing/2015/9/8/chartex" xmlns:cx2="http://schemas.microsoft.com/office/drawing/2015/10/21/chartex" xmlns:cx3="http://schemas.microsoft.com/office/drawing/2016/5/9/chartex" xmlns:cx4="http://schemas.microsoft.com/office/drawing/2016/5/10/chartex" xmlns:cx5="http://schemas.microsoft.com/office/drawing/2016/5/11/chartex" xmlns:cx6="http://schemas.microsoft.com/office/drawing/2016/5/12/chartex" xmlns:cx7="http://schemas.microsoft.com/office/drawing/2016/5/13/chartex" xmlns:cx8="http://schemas.microsoft.com/office/drawing/2016/5/14/chartex" xmlns:mc="http://schemas.openxmlformats.org/markup-compatibility/2006" xmlns:aink="http://schemas.microsoft.com/office/drawing/2016/ink" xmlns:am3d="http://schemas.microsoft.com/office/drawing/2017/model3d" xmlns:o="urn:schemas-microsoft-com:office:office" xmlns:oel="http://schemas.microsoft.com/office/2019/extlst" xmlns:r="http://schemas.openxmlformats.org/officeDocument/2006/relationships" xmlns:m="http://schemas.openxmlformats.org/officeDocument/2006/math" xmlns:v="urn:schemas-microsoft-com:vml" xmlns:wp14="http://schemas.microsoft.com/office/word/2010/wordprocessingDrawing" xmlns:wp="http://schemas.openxmlformats.org/drawingml/2006/wordprocessingDrawing" xmlns:w10="urn:schemas-microsoft-com:office:word" xmlns:w="http://schemas.openxmlformats.org/wordprocessingml/2006/main" xmlns:w14="http://schemas.microsoft.com/office/word/2010/wordml" xmlns:w15="http://schemas.microsoft.com/office/word/2012/wordml" xmlns:w16cex="http://schemas.microsoft.com/office/word/2018/wordml/cex" xmlns:w16cid="http://schemas.microsoft.com/office/word/2016/wordml/cid" xmlns:w16="http://schemas.microsoft.com/office/word/2018/wordml" xmlns:w16du="http://schemas.microsoft.com/office/word/2023/wordml/word16du" xmlns:w16sdtdh="http://schemas.microsoft.com/office/word/2020/wordml/sdtdatahash" xmlns:w16sdtfl="http://schemas.microsoft.com/office/word/2024/wordml/sdtformatlock" xmlns:w16se="http://schemas.microsoft.com/office/word/2015/wordml/symex" xmlns:wpg="http://schemas.microsoft.com/office/word/2010/wordprocessingGroup" xmlns:wpi="http://schemas.microsoft.com/office/word/2010/wordprocessingInk" xmlns:wne="http://schemas.microsoft.com/office/word/2006/wordml" xmlns:wps="http://schemas.microsoft.com/office/word/2010/wordprocessingShape" mc:Ignorable="w14 w15 w16se w16cid w16 w16cex w16sdtdh w16sdtfl w16du wp14">
   <w:abstractNum w:abstractNumId="0" w15:restartNumberingAfterBreak="0">
@@ -23873,10 +25454,16 @@
     <w:link w:val="Heading1Char"/>
     <w:uiPriority w:val="9"/>
     <w:qFormat/>
-    <w:rsid w:val="009C6064"/>
+    <w:rsid w:val="00674177"/>
     <w:pPr>
+      <w:jc w:val="left"/>
       <w:outlineLvl w:val="0"/>
     </w:pPr>
+    <w:rPr>
+      <w:noProof/>
+      <w:sz w:val="44"/>
+      <w:szCs w:val="40"/>
+    </w:rPr>
   </w:style>
   <w:style w:type="paragraph" w:styleId="Heading2">
     <w:name w:val="heading 2"/>
@@ -24049,7 +25636,6 @@
   <w:style w:type="character" w:default="1" w:styleId="DefaultParagraphFont">
     <w:name w:val="Default Paragraph Font"/>
     <w:uiPriority w:val="1"/>
-    <w:semiHidden/>
     <w:unhideWhenUsed/>
   </w:style>
   <w:style w:type="table" w:default="1" w:styleId="TableNormal">
@@ -24078,14 +25664,15 @@
     <w:basedOn w:val="DefaultParagraphFont"/>
     <w:link w:val="Heading1"/>
     <w:uiPriority w:val="9"/>
-    <w:rsid w:val="009C6064"/>
+    <w:rsid w:val="00674177"/>
     <w:rPr>
       <w:rFonts w:ascii="Baskerville" w:eastAsiaTheme="majorEastAsia" w:hAnsi="Baskerville" w:cstheme="majorBidi"/>
+      <w:noProof/>
       <w:color w:val="808080" w:themeColor="background1" w:themeShade="80"/>
       <w:spacing w:val="-10"/>
       <w:kern w:val="28"/>
-      <w:sz w:val="48"/>
-      <w:szCs w:val="56"/>
+      <w:sz w:val="44"/>
+      <w:szCs w:val="40"/>
       <w:lang w:val="es-ES"/>
     </w:rPr>
   </w:style>

</xml_diff>